<commit_message>
Fix broken hyperlinks by adding Hyperlink character style to styles.xml
The hyperlinks weren't clickable because the rStyle w:val="Hyperlink"
referenced a style that didn't exist in the document. Added the Hyperlink
character style definition to styles.xml so Word and other viewers can
resolve the links correctly.

https://claude.ai/code/session_01U3WqWP1TXbCcMwgjBVLhkU
</commit_message>
<xml_diff>
--- a/Cayuga_Lake_Chapter_v2.docx
+++ b/Cayuga_Lake_Chapter_v2.docx
@@ -18403,6 +18403,16 @@
         <w:shd w:val="clear" w:color="auto" w:fill="FBCAA2" w:themeFill="accent6" w:themeFillTint="7F"/>
       </w:tcPr>
     </w:tblStylePr>
+  </w:style>
+  <w:style w:type="character" w:styleId="Hyperlink">
+    <w:name w:val="Hyperlink"/>
+    <w:basedOn w:val="DefaultParagraphFont"/>
+    <w:uiPriority w:val="99"/>
+    <w:unhideWhenUsed/>
+    <w:rPr>
+      <w:color w:val="0563C1"/>
+      <w:u w:val="single"/>
+    </w:rPr>
   </w:style>
 </w:styles>
 </file>

</xml_diff>

<commit_message>
Fix hyperlinks: use OxmlElement approach with w:history attribute
Switched from parse_xml to OxmlElement for building hyperlink elements,
which avoids potential namespace serialization issues. Added w:history="1"
attribute that Word expects on hyperlink elements for click behavior.

https://claude.ai/code/session_01U3WqWP1TXbCcMwgjBVLhkU
</commit_message>
<xml_diff>
--- a/Cayuga_Lake_Chapter_v2.docx
+++ b/Cayuga_Lake_Chapter_v2.docx
@@ -71,7 +71,7 @@
         </w:rPr>
         <w:t xml:space="preserve">, looking south toward </w:t>
       </w:r>
-      <w:hyperlink r:id="rId9">
+      <w:hyperlink r:id="rId9" w:history="1">
         <w:r>
           <w:rPr>
             <w:rStyle w:val="Hyperlink"/>
@@ -109,7 +109,7 @@
         </w:rPr>
         <w:t xml:space="preserve">Cayuga is the longest lake in the region and the one that rewards people who stay more than two nights. The reform corridor between </w:t>
       </w:r>
-      <w:hyperlink r:id="rId10">
+      <w:hyperlink r:id="rId10" w:history="1">
         <w:r>
           <w:rPr>
             <w:rStyle w:val="Hyperlink"/>
@@ -127,7 +127,7 @@
         </w:rPr>
         <w:t xml:space="preserve"> and </w:t>
       </w:r>
-      <w:hyperlink r:id="rId11">
+      <w:hyperlink r:id="rId11" w:history="1">
         <w:r>
           <w:rPr>
             <w:rStyle w:val="Hyperlink"/>
@@ -145,7 +145,7 @@
         </w:rPr>
         <w:t xml:space="preserve"> is the most historically consequential fifteen miles in New York State. Base in </w:t>
       </w:r>
-      <w:hyperlink r:id="rId9">
+      <w:hyperlink r:id="rId9" w:history="1">
         <w:r>
           <w:rPr>
             <w:rStyle w:val="Hyperlink"/>
@@ -163,7 +163,7 @@
         </w:rPr>
         <w:t xml:space="preserve"> or </w:t>
       </w:r>
-      <w:hyperlink r:id="rId12">
+      <w:hyperlink r:id="rId12" w:history="1">
         <w:r>
           <w:rPr>
             <w:rStyle w:val="Hyperlink"/>
@@ -200,7 +200,7 @@
         </w:rPr>
         <w:t xml:space="preserve">Cayuga Lake is 38.9 miles long and 435 feet deep, the longest of the eleven </w:t>
       </w:r>
-      <w:hyperlink r:id="rId13">
+      <w:hyperlink r:id="rId13" w:history="1">
         <w:r>
           <w:rPr>
             <w:rStyle w:val="Hyperlink"/>
@@ -218,7 +218,7 @@
         </w:rPr>
         <w:t xml:space="preserve"> and the second deepest. It runs north-south through three counties: </w:t>
       </w:r>
-      <w:hyperlink r:id="rId14">
+      <w:hyperlink r:id="rId14" w:history="1">
         <w:r>
           <w:rPr>
             <w:rStyle w:val="Hyperlink"/>
@@ -236,7 +236,7 @@
         </w:rPr>
         <w:t xml:space="preserve">, </w:t>
       </w:r>
-      <w:hyperlink r:id="rId15">
+      <w:hyperlink r:id="rId15" w:history="1">
         <w:r>
           <w:rPr>
             <w:rStyle w:val="Hyperlink"/>
@@ -254,7 +254,7 @@
         </w:rPr>
         <w:t xml:space="preserve">, and </w:t>
       </w:r>
-      <w:hyperlink r:id="rId16">
+      <w:hyperlink r:id="rId16" w:history="1">
         <w:r>
           <w:rPr>
             <w:rStyle w:val="Hyperlink"/>
@@ -272,7 +272,7 @@
         </w:rPr>
         <w:t xml:space="preserve">. </w:t>
       </w:r>
-      <w:hyperlink r:id="rId9">
+      <w:hyperlink r:id="rId9" w:history="1">
         <w:r>
           <w:rPr>
             <w:rStyle w:val="Hyperlink"/>
@@ -290,7 +290,7 @@
         </w:rPr>
         <w:t xml:space="preserve"> sits at the southern tip where the land rises sharply on both sides and the gorges begin. </w:t>
       </w:r>
-      <w:hyperlink r:id="rId10">
+      <w:hyperlink r:id="rId10" w:history="1">
         <w:r>
           <w:rPr>
             <w:rStyle w:val="Hyperlink"/>
@@ -308,7 +308,7 @@
         </w:rPr>
         <w:t xml:space="preserve"> anchors the north, where </w:t>
       </w:r>
-      <w:hyperlink r:id="rId17">
+      <w:hyperlink r:id="rId17" w:history="1">
         <w:r>
           <w:rPr>
             <w:rStyle w:val="Hyperlink"/>
@@ -326,7 +326,7 @@
         </w:rPr>
         <w:t xml:space="preserve"> lived for the last 54 years of her life. More than 150 waterfalls lie within ten miles of downtown </w:t>
       </w:r>
-      <w:hyperlink r:id="rId9">
+      <w:hyperlink r:id="rId9" w:history="1">
         <w:r>
           <w:rPr>
             <w:rStyle w:val="Hyperlink"/>
@@ -352,7 +352,7 @@
         </w:rPr>
         <w:t xml:space="preserve">The </w:t>
       </w:r>
-      <w:hyperlink r:id="rId18">
+      <w:hyperlink r:id="rId18" w:history="1">
         <w:r>
           <w:rPr>
             <w:rStyle w:val="Hyperlink"/>
@@ -370,7 +370,7 @@
         </w:rPr>
         <w:t xml:space="preserve">, Gayogo̱hó:nǫʼ in their own language, are the People of the Great Swamp and one of the founding nations of the </w:t>
       </w:r>
-      <w:hyperlink r:id="rId19">
+      <w:hyperlink r:id="rId19" w:history="1">
         <w:r>
           <w:rPr>
             <w:rStyle w:val="Hyperlink"/>
@@ -388,7 +388,7 @@
         </w:rPr>
         <w:t xml:space="preserve">. They held the territory around Cayuga Lake for centuries, sustained by the same agricultural conditions that make the land productive today. The </w:t>
       </w:r>
-      <w:hyperlink r:id="rId20">
+      <w:hyperlink r:id="rId20" w:history="1">
         <w:r>
           <w:rPr>
             <w:rStyle w:val="Hyperlink"/>
@@ -414,7 +414,7 @@
         </w:rPr>
         <w:t xml:space="preserve">The </w:t>
       </w:r>
-      <w:hyperlink r:id="rId21">
+      <w:hyperlink r:id="rId21" w:history="1">
         <w:r>
           <w:rPr>
             <w:rStyle w:val="Hyperlink"/>
@@ -432,7 +432,7 @@
         </w:rPr>
         <w:t xml:space="preserve"> was the first organized wine trail in the United States, established in 1983. There are 21 producers in the current passport. The farms along Route 89 have been there longer than the trail designation. The reform corridor between </w:t>
       </w:r>
-      <w:hyperlink r:id="rId10">
+      <w:hyperlink r:id="rId10" w:history="1">
         <w:r>
           <w:rPr>
             <w:rStyle w:val="Hyperlink"/>
@@ -450,7 +450,7 @@
         </w:rPr>
         <w:t xml:space="preserve"> and </w:t>
       </w:r>
-      <w:hyperlink r:id="rId11">
+      <w:hyperlink r:id="rId11" w:history="1">
         <w:r>
           <w:rPr>
             <w:rStyle w:val="Hyperlink"/>
@@ -470,7 +470,7 @@
       </w:r>
     </w:p>
     <w:p>
-      <w:hyperlink r:id="rId12">
+      <w:hyperlink r:id="rId12" w:history="1">
         <w:r>
           <w:rPr>
             <w:rStyle w:val="Hyperlink"/>
@@ -488,7 +488,7 @@
         </w:rPr>
         <w:t xml:space="preserve"> is under one square mile. In 1833, a man named E.B. Morgan built an inn on Aurora's main street. Morgan was a co-founder of the </w:t>
       </w:r>
-      <w:hyperlink r:id="rId22">
+      <w:hyperlink r:id="rId22" w:history="1">
         <w:r>
           <w:rPr>
             <w:rStyle w:val="Hyperlink"/>
@@ -506,7 +506,7 @@
         </w:rPr>
         <w:t xml:space="preserve">. In 1852, Henry Wells moved his family here and began building a house on a strip of land between the lake and a ravine, which he named Glen Park. Wells had recently co-founded two companies: </w:t>
       </w:r>
-      <w:hyperlink r:id="rId23">
+      <w:hyperlink r:id="rId23" w:history="1">
         <w:r>
           <w:rPr>
             <w:rStyle w:val="Hyperlink"/>
@@ -524,7 +524,7 @@
         </w:rPr>
         <w:t xml:space="preserve"> and </w:t>
       </w:r>
-      <w:hyperlink r:id="rId24">
+      <w:hyperlink r:id="rId24" w:history="1">
         <w:r>
           <w:rPr>
             <w:rStyle w:val="Hyperlink"/>
@@ -542,7 +542,7 @@
         </w:rPr>
         <w:t xml:space="preserve">. He considered higher education for women to be, in his words, "the dream of my life." In 1868 he founded </w:t>
       </w:r>
-      <w:hyperlink r:id="rId25">
+      <w:hyperlink r:id="rId25" w:history="1">
         <w:r>
           <w:rPr>
             <w:rStyle w:val="Hyperlink"/>
@@ -560,7 +560,7 @@
         </w:rPr>
         <w:t xml:space="preserve"> on the land adjacent to Glen Park. Future president </w:t>
       </w:r>
-      <w:hyperlink r:id="rId26">
+      <w:hyperlink r:id="rId26" w:history="1">
         <w:r>
           <w:rPr>
             <w:rStyle w:val="Hyperlink"/>
@@ -578,7 +578,7 @@
         </w:rPr>
         <w:t xml:space="preserve"> had already attended the Cayuga Lake Academy in </w:t>
       </w:r>
-      <w:hyperlink r:id="rId12">
+      <w:hyperlink r:id="rId12" w:history="1">
         <w:r>
           <w:rPr>
             <w:rStyle w:val="Hyperlink"/>
@@ -596,7 +596,7 @@
         </w:rPr>
         <w:t xml:space="preserve"> a generation earlier. In 1962, a young woman named Pleasant Rowland graduated from </w:t>
       </w:r>
-      <w:hyperlink r:id="rId25">
+      <w:hyperlink r:id="rId25" w:history="1">
         <w:r>
           <w:rPr>
             <w:rStyle w:val="Hyperlink"/>
@@ -614,7 +614,7 @@
         </w:rPr>
         <w:t xml:space="preserve">. She went on to create the </w:t>
       </w:r>
-      <w:hyperlink r:id="rId27">
+      <w:hyperlink r:id="rId27" w:history="1">
         <w:r>
           <w:rPr>
             <w:rStyle w:val="Hyperlink"/>
@@ -632,7 +632,7 @@
         </w:rPr>
         <w:t xml:space="preserve"> doll line, sold it to Mattel in 1998 for $700 million, and came back to </w:t>
       </w:r>
-      <w:hyperlink r:id="rId12">
+      <w:hyperlink r:id="rId12" w:history="1">
         <w:r>
           <w:rPr>
             <w:rStyle w:val="Hyperlink"/>
@@ -650,7 +650,7 @@
         </w:rPr>
         <w:t xml:space="preserve">. The </w:t>
       </w:r>
-      <w:hyperlink r:id="rId28">
+      <w:hyperlink r:id="rId28" w:history="1">
         <w:r>
           <w:rPr>
             <w:rStyle w:val="Hyperlink"/>
@@ -668,7 +668,7 @@
         </w:rPr>
         <w:t xml:space="preserve">, Morgan's building, had closed in 2000. The village was failing, incrementally and then all at once. Rowland bought the inn and restored it. Then she bought more buildings. Then she bought </w:t>
       </w:r>
-      <w:hyperlink r:id="rId29">
+      <w:hyperlink r:id="rId29" w:history="1">
         <w:r>
           <w:rPr>
             <w:rStyle w:val="Hyperlink"/>
@@ -686,7 +686,7 @@
         </w:rPr>
         <w:t xml:space="preserve">, the home goods company headquartered on a farm just south of the village, when it was on the verge of closing. The </w:t>
       </w:r>
-      <w:hyperlink r:id="rId28">
+      <w:hyperlink r:id="rId28" w:history="1">
         <w:r>
           <w:rPr>
             <w:rStyle w:val="Hyperlink"/>
@@ -993,7 +993,7 @@
         </w:rPr>
         <w:t xml:space="preserve">Cayuga Lake is long enough to have meaningfully different communities at different points along its shore. </w:t>
       </w:r>
-      <w:hyperlink r:id="rId9">
+      <w:hyperlink r:id="rId9" w:history="1">
         <w:r>
           <w:rPr>
             <w:rStyle w:val="Hyperlink"/>
@@ -1011,7 +1011,7 @@
         </w:rPr>
         <w:t xml:space="preserve"> anchors the south with gorge trails and universities. </w:t>
       </w:r>
-      <w:hyperlink r:id="rId10">
+      <w:hyperlink r:id="rId10" w:history="1">
         <w:r>
           <w:rPr>
             <w:rStyle w:val="Hyperlink"/>
@@ -1029,7 +1029,7 @@
         </w:rPr>
         <w:t xml:space="preserve"> anchors the north with two national parks and the most consequential square mile in 19th-century American civil rights history. </w:t>
       </w:r>
-      <w:hyperlink r:id="rId12">
+      <w:hyperlink r:id="rId12" w:history="1">
         <w:r>
           <w:rPr>
             <w:rStyle w:val="Hyperlink"/>
@@ -1059,7 +1059,7 @@
       </w:r>
     </w:p>
     <w:p>
-      <w:hyperlink r:id="rId17">
+      <w:hyperlink r:id="rId17" w:history="1">
         <w:r>
           <w:rPr>
             <w:rStyle w:val="Hyperlink"/>
@@ -1078,7 +1078,7 @@
         </w:rPr>
         <w:t xml:space="preserve">'s home at 180 South Street, </w:t>
       </w:r>
-      <w:hyperlink r:id="rId10">
+      <w:hyperlink r:id="rId10" w:history="1">
         <w:r>
           <w:rPr>
             <w:rStyle w:val="Hyperlink"/>
@@ -1097,7 +1097,7 @@
         </w:rPr>
         <w:t xml:space="preserve"> — now the </w:t>
       </w:r>
-      <w:hyperlink r:id="rId30">
+      <w:hyperlink r:id="rId30" w:history="1">
         <w:r>
           <w:rPr>
             <w:rStyle w:val="Hyperlink"/>
@@ -1139,7 +1139,7 @@
       </w:r>
     </w:p>
     <w:p>
-      <w:hyperlink r:id="rId10">
+      <w:hyperlink r:id="rId10" w:history="1">
         <w:r>
           <w:rPr>
             <w:rStyle w:val="Hyperlink"/>
@@ -1157,7 +1157,7 @@
         </w:rPr>
         <w:t xml:space="preserve"> calls itself History's Hometown, which is the kind of claim that usually invites skepticism. Here it holds up. Within six blocks of downtown </w:t>
       </w:r>
-      <w:hyperlink r:id="rId10">
+      <w:hyperlink r:id="rId10" w:history="1">
         <w:r>
           <w:rPr>
             <w:rStyle w:val="Hyperlink"/>
@@ -1175,7 +1175,7 @@
         </w:rPr>
         <w:t xml:space="preserve">, you have the home and burial site of </w:t>
       </w:r>
-      <w:hyperlink r:id="rId17">
+      <w:hyperlink r:id="rId17" w:history="1">
         <w:r>
           <w:rPr>
             <w:rStyle w:val="Hyperlink"/>
@@ -1193,7 +1193,7 @@
         </w:rPr>
         <w:t xml:space="preserve">, the home of </w:t>
       </w:r>
-      <w:hyperlink r:id="rId31">
+      <w:hyperlink r:id="rId31" w:history="1">
         <w:r>
           <w:rPr>
             <w:rStyle w:val="Hyperlink"/>
@@ -1211,7 +1211,7 @@
         </w:rPr>
         <w:t xml:space="preserve">, the only complete unaltered Tiffany interior in the United States, and the </w:t>
       </w:r>
-      <w:hyperlink r:id="rId32">
+      <w:hyperlink r:id="rId32" w:history="1">
         <w:r>
           <w:rPr>
             <w:rStyle w:val="Hyperlink"/>
@@ -1229,7 +1229,7 @@
         </w:rPr>
         <w:t xml:space="preserve">. </w:t>
       </w:r>
-      <w:hyperlink r:id="rId10">
+      <w:hyperlink r:id="rId10" w:history="1">
         <w:r>
           <w:rPr>
             <w:rStyle w:val="Hyperlink"/>
@@ -1255,7 +1255,7 @@
         </w:rPr>
         <w:t xml:space="preserve">The city sits at the northern end of </w:t>
       </w:r>
-      <w:hyperlink r:id="rId33">
+      <w:hyperlink r:id="rId33" w:history="1">
         <w:r>
           <w:rPr>
             <w:rStyle w:val="Hyperlink"/>
@@ -1273,7 +1273,7 @@
         </w:rPr>
         <w:t xml:space="preserve">, one of the eastern </w:t>
       </w:r>
-      <w:hyperlink r:id="rId13">
+      <w:hyperlink r:id="rId13" w:history="1">
         <w:r>
           <w:rPr>
             <w:rStyle w:val="Hyperlink"/>
@@ -1291,7 +1291,7 @@
         </w:rPr>
         <w:t xml:space="preserve">, and is the economic center for the northern end of Cayuga. It has a working downtown, independent restaurants and breweries, and the weight of history distributed across it in a way that rewards walking rather than driving. March 10 is observed annually as </w:t>
       </w:r>
-      <w:hyperlink r:id="rId17">
+      <w:hyperlink r:id="rId17" w:history="1">
         <w:r>
           <w:rPr>
             <w:rStyle w:val="Hyperlink"/>
@@ -1338,7 +1338,7 @@
         </w:rPr>
         <w:t xml:space="preserve">See the anchor identity section above — the full biography is there. What's worth adding for the town portrait: </w:t>
       </w:r>
-      <w:hyperlink r:id="rId12">
+      <w:hyperlink r:id="rId12" w:history="1">
         <w:r>
           <w:rPr>
             <w:rStyle w:val="Hyperlink"/>
@@ -1356,7 +1356,7 @@
         </w:rPr>
         <w:t xml:space="preserve"> is walkable in twenty minutes, and those twenty minutes pass the </w:t>
       </w:r>
-      <w:hyperlink r:id="rId28">
+      <w:hyperlink r:id="rId28" w:history="1">
         <w:r>
           <w:rPr>
             <w:rStyle w:val="Hyperlink"/>
@@ -1374,7 +1374,7 @@
         </w:rPr>
         <w:t xml:space="preserve">, the Fargo Bar, the </w:t>
       </w:r>
-      <w:hyperlink r:id="rId29">
+      <w:hyperlink r:id="rId29" w:history="1">
         <w:r>
           <w:rPr>
             <w:rStyle w:val="Hyperlink"/>
@@ -1392,7 +1392,7 @@
         </w:rPr>
         <w:t xml:space="preserve"> village store, and a clear view of the lake from the elm-lined main street. </w:t>
       </w:r>
-      <w:hyperlink r:id="rId34">
+      <w:hyperlink r:id="rId34" w:history="1">
         <w:r>
           <w:rPr>
             <w:rStyle w:val="Hyperlink"/>
@@ -1429,7 +1429,7 @@
         </w:rPr>
         <w:t xml:space="preserve">The </w:t>
       </w:r>
-      <w:hyperlink r:id="rId28">
+      <w:hyperlink r:id="rId28" w:history="1">
         <w:r>
           <w:rPr>
             <w:rStyle w:val="Hyperlink"/>
@@ -1448,7 +1448,7 @@
         </w:rPr>
         <w:t xml:space="preserve">, built 1833 by New York Times co-founder E.B. Morgan. One of five historic properties comprising the </w:t>
       </w:r>
-      <w:hyperlink r:id="rId28">
+      <w:hyperlink r:id="rId28" w:history="1">
         <w:r>
           <w:rPr>
             <w:rStyle w:val="Hyperlink"/>
@@ -1490,7 +1490,7 @@
       </w:r>
     </w:p>
     <w:p>
-      <w:hyperlink r:id="rId9">
+      <w:hyperlink r:id="rId9" w:history="1">
         <w:r>
           <w:rPr>
             <w:rStyle w:val="Hyperlink"/>
@@ -1508,7 +1508,7 @@
         </w:rPr>
         <w:t xml:space="preserve"> sits at Cayuga's southern tip where the land rises sharply on both sides and the gorges begin. </w:t>
       </w:r>
-      <w:hyperlink r:id="rId35">
+      <w:hyperlink r:id="rId35" w:history="1">
         <w:r>
           <w:rPr>
             <w:rStyle w:val="Hyperlink"/>
@@ -1526,7 +1526,7 @@
         </w:rPr>
         <w:t xml:space="preserve">'s alma mater — "Far Above Cayuga's Waters" — is considered the most widely copied university song in American higher education, which is a useful index of how far Cayuga Lake's reputation has traveled. </w:t>
       </w:r>
-      <w:hyperlink r:id="rId36">
+      <w:hyperlink r:id="rId36" w:history="1">
         <w:r>
           <w:rPr>
             <w:rStyle w:val="Hyperlink"/>
@@ -1552,7 +1552,7 @@
         </w:rPr>
         <w:t xml:space="preserve">The number that lands: more than 150 waterfalls within ten miles of downtown. The </w:t>
       </w:r>
-      <w:hyperlink r:id="rId37">
+      <w:hyperlink r:id="rId37" w:history="1">
         <w:r>
           <w:rPr>
             <w:rStyle w:val="Hyperlink"/>
@@ -1570,7 +1570,7 @@
         </w:rPr>
         <w:t xml:space="preserve"> trail runs from the Commons to the </w:t>
       </w:r>
-      <w:hyperlink r:id="rId35">
+      <w:hyperlink r:id="rId35" w:history="1">
         <w:r>
           <w:rPr>
             <w:rStyle w:val="Hyperlink"/>
@@ -1588,7 +1588,7 @@
         </w:rPr>
         <w:t xml:space="preserve"> campus — 400 feet of elevation, six waterfalls, stone staircases built in the 1920s. It is also, for some </w:t>
       </w:r>
-      <w:hyperlink r:id="rId35">
+      <w:hyperlink r:id="rId35" w:history="1">
         <w:r>
           <w:rPr>
             <w:rStyle w:val="Hyperlink"/>
@@ -1606,7 +1606,7 @@
         </w:rPr>
         <w:t xml:space="preserve"> students, just the commute. </w:t>
       </w:r>
-      <w:hyperlink r:id="rId38">
+      <w:hyperlink r:id="rId38" w:history="1">
         <w:r>
           <w:rPr>
             <w:rStyle w:val="Hyperlink"/>
@@ -1624,7 +1624,7 @@
         </w:rPr>
         <w:t xml:space="preserve"> at the lake's edge south of the marina was formerly the site of the Wharton Brothers silent film studios — one of the earliest American film production centers before Hollywood. </w:t>
       </w:r>
-      <w:hyperlink r:id="rId39">
+      <w:hyperlink r:id="rId39" w:history="1">
         <w:r>
           <w:rPr>
             <w:rStyle w:val="Hyperlink"/>
@@ -1642,7 +1642,7 @@
         </w:rPr>
         <w:t xml:space="preserve">, creator of The Twilight Zone, summered in </w:t>
       </w:r>
-      <w:hyperlink r:id="rId40">
+      <w:hyperlink r:id="rId40" w:history="1">
         <w:r>
           <w:rPr>
             <w:rStyle w:val="Hyperlink"/>
@@ -1672,7 +1672,7 @@
       </w:r>
     </w:p>
     <w:p>
-      <w:hyperlink r:id="rId37">
+      <w:hyperlink r:id="rId37" w:history="1">
         <w:r>
           <w:rPr>
             <w:rStyle w:val="Hyperlink"/>
@@ -1691,7 +1691,7 @@
         </w:rPr>
         <w:t xml:space="preserve">, </w:t>
       </w:r>
-      <w:hyperlink r:id="rId9">
+      <w:hyperlink r:id="rId9" w:history="1">
         <w:r>
           <w:rPr>
             <w:rStyle w:val="Hyperlink"/>
@@ -1739,7 +1739,7 @@
         </w:rPr>
         <w:t xml:space="preserve">On July 19-20, 1848, 300 people gathered in the </w:t>
       </w:r>
-      <w:hyperlink r:id="rId41">
+      <w:hyperlink r:id="rId41" w:history="1">
         <w:r>
           <w:rPr>
             <w:rStyle w:val="Hyperlink"/>
@@ -1757,7 +1757,7 @@
         </w:rPr>
         <w:t xml:space="preserve"> here for the first formal women's rights convention in American history. </w:t>
       </w:r>
-      <w:hyperlink r:id="rId42">
+      <w:hyperlink r:id="rId42" w:history="1">
         <w:r>
           <w:rPr>
             <w:rStyle w:val="Hyperlink"/>
@@ -1775,7 +1775,7 @@
         </w:rPr>
         <w:t xml:space="preserve"> read the Declaration of Sentiments, modeled phrase for phrase on Jefferson's Declaration of Independence. </w:t>
       </w:r>
-      <w:hyperlink r:id="rId43">
+      <w:hyperlink r:id="rId43" w:history="1">
         <w:r>
           <w:rPr>
             <w:rStyle w:val="Hyperlink"/>
@@ -1801,7 +1801,7 @@
         </w:rPr>
         <w:t xml:space="preserve">The </w:t>
       </w:r>
-      <w:hyperlink r:id="rId44">
+      <w:hyperlink r:id="rId44" w:history="1">
         <w:r>
           <w:rPr>
             <w:rStyle w:val="Hyperlink"/>
@@ -1819,7 +1819,7 @@
         </w:rPr>
         <w:t xml:space="preserve"> encompasses the chapel, the M'Clintock House in </w:t>
       </w:r>
-      <w:hyperlink r:id="rId45">
+      <w:hyperlink r:id="rId45" w:history="1">
         <w:r>
           <w:rPr>
             <w:rStyle w:val="Hyperlink"/>
@@ -1837,7 +1837,7 @@
         </w:rPr>
         <w:t xml:space="preserve"> where the Declaration was drafted, and Stanton's home. The town also claims, with varying degrees of scholarly support, to be the inspiration for Bedford Falls in It's a Wonderful Life. The claim has been disputed for decades. </w:t>
       </w:r>
-      <w:hyperlink r:id="rId11">
+      <w:hyperlink r:id="rId11" w:history="1">
         <w:r>
           <w:rPr>
             <w:rStyle w:val="Hyperlink"/>
@@ -1874,7 +1874,7 @@
         </w:rPr>
         <w:t xml:space="preserve">The </w:t>
       </w:r>
-      <w:hyperlink r:id="rId41">
+      <w:hyperlink r:id="rId41" w:history="1">
         <w:r>
           <w:rPr>
             <w:rStyle w:val="Hyperlink"/>
@@ -1893,7 +1893,7 @@
         </w:rPr>
         <w:t xml:space="preserve">, </w:t>
       </w:r>
-      <w:hyperlink r:id="rId11">
+      <w:hyperlink r:id="rId11" w:history="1">
         <w:r>
           <w:rPr>
             <w:rStyle w:val="Hyperlink"/>
@@ -1912,7 +1912,7 @@
         </w:rPr>
         <w:t xml:space="preserve">. Site of the 1848 Women's Rights Convention. Now part of the </w:t>
       </w:r>
-      <w:hyperlink r:id="rId46">
+      <w:hyperlink r:id="rId46" w:history="1">
         <w:r>
           <w:rPr>
             <w:rStyle w:val="Hyperlink"/>
@@ -1960,7 +1960,7 @@
         </w:rPr>
         <w:t xml:space="preserve">Two miles south of </w:t>
       </w:r>
-      <w:hyperlink r:id="rId47">
+      <w:hyperlink r:id="rId47" w:history="1">
         <w:r>
           <w:rPr>
             <w:rStyle w:val="Hyperlink"/>
@@ -1978,7 +1978,7 @@
         </w:rPr>
         <w:t xml:space="preserve"> and two miles north of the </w:t>
       </w:r>
-      <w:hyperlink r:id="rId48">
+      <w:hyperlink r:id="rId48" w:history="1">
         <w:r>
           <w:rPr>
             <w:rStyle w:val="Hyperlink"/>
@@ -1996,7 +1996,7 @@
         </w:rPr>
         <w:t xml:space="preserve"> at </w:t>
       </w:r>
-      <w:hyperlink r:id="rId49">
+      <w:hyperlink r:id="rId49" w:history="1">
         <w:r>
           <w:rPr>
             <w:rStyle w:val="Hyperlink"/>
@@ -2037,7 +2037,7 @@
       </w:r>
     </w:p>
     <w:p>
-      <w:hyperlink r:id="rId50">
+      <w:hyperlink r:id="rId50" w:history="1">
         <w:r>
           <w:rPr>
             <w:rStyle w:val="Hyperlink"/>
@@ -2055,7 +2055,7 @@
         </w:rPr>
         <w:t xml:space="preserve"> is here — one of the trail's most focused producers, small-production Riesling from the east shore. The </w:t>
       </w:r>
-      <w:hyperlink r:id="rId51">
+      <w:hyperlink r:id="rId51" w:history="1">
         <w:r>
           <w:rPr>
             <w:rStyle w:val="Hyperlink"/>
@@ -2096,7 +2096,7 @@
       </w:r>
     </w:p>
     <w:p>
-      <w:hyperlink r:id="rId17">
+      <w:hyperlink r:id="rId17" w:history="1">
         <w:r>
           <w:rPr>
             <w:rStyle w:val="Hyperlink"/>
@@ -2115,7 +2115,7 @@
         </w:rPr>
         <w:t xml:space="preserve">, c. 1868. She moved to </w:t>
       </w:r>
-      <w:hyperlink r:id="rId10">
+      <w:hyperlink r:id="rId10" w:history="1">
         <w:r>
           <w:rPr>
             <w:rStyle w:val="Hyperlink"/>
@@ -2142,7 +2142,7 @@
         </w:rPr>
         <w:t xml:space="preserve">The fifteen miles between </w:t>
       </w:r>
-      <w:hyperlink r:id="rId10">
+      <w:hyperlink r:id="rId10" w:history="1">
         <w:r>
           <w:rPr>
             <w:rStyle w:val="Hyperlink"/>
@@ -2160,7 +2160,7 @@
         </w:rPr>
         <w:t xml:space="preserve"> and </w:t>
       </w:r>
-      <w:hyperlink r:id="rId11">
+      <w:hyperlink r:id="rId11" w:history="1">
         <w:r>
           <w:rPr>
             <w:rStyle w:val="Hyperlink"/>
@@ -2186,7 +2186,7 @@
         </w:rPr>
         <w:t xml:space="preserve">The reform movements that produced all of this were not separate campaigns that happened to overlap geographically. They were the same network — the same Quaker meeting houses, the same abolitionist families, the same roads. </w:t>
       </w:r>
-      <w:hyperlink r:id="rId17">
+      <w:hyperlink r:id="rId17" w:history="1">
         <w:r>
           <w:rPr>
             <w:rStyle w:val="Hyperlink"/>
@@ -2204,7 +2204,7 @@
         </w:rPr>
         <w:t xml:space="preserve"> and </w:t>
       </w:r>
-      <w:hyperlink r:id="rId42">
+      <w:hyperlink r:id="rId42" w:history="1">
         <w:r>
           <w:rPr>
             <w:rStyle w:val="Hyperlink"/>
@@ -2222,7 +2222,7 @@
         </w:rPr>
         <w:t xml:space="preserve"> knew each other. </w:t>
       </w:r>
-      <w:hyperlink r:id="rId43">
+      <w:hyperlink r:id="rId43" w:history="1">
         <w:r>
           <w:rPr>
             <w:rStyle w:val="Hyperlink"/>
@@ -2240,7 +2240,7 @@
         </w:rPr>
         <w:t xml:space="preserve"> was a guest at the </w:t>
       </w:r>
-      <w:hyperlink r:id="rId52">
+      <w:hyperlink r:id="rId52" w:history="1">
         <w:r>
           <w:rPr>
             <w:rStyle w:val="Hyperlink"/>
@@ -2258,7 +2258,7 @@
         </w:rPr>
         <w:t xml:space="preserve"> in </w:t>
       </w:r>
-      <w:hyperlink r:id="rId10">
+      <w:hyperlink r:id="rId10" w:history="1">
         <w:r>
           <w:rPr>
             <w:rStyle w:val="Hyperlink"/>
@@ -2276,7 +2276,7 @@
         </w:rPr>
         <w:t xml:space="preserve"> and a speaker at the </w:t>
       </w:r>
-      <w:hyperlink r:id="rId11">
+      <w:hyperlink r:id="rId11" w:history="1">
         <w:r>
           <w:rPr>
             <w:rStyle w:val="Hyperlink"/>
@@ -2302,7 +2302,7 @@
         </w:rPr>
         <w:t xml:space="preserve">To this day, the </w:t>
       </w:r>
-      <w:hyperlink r:id="rId19">
+      <w:hyperlink r:id="rId19" w:history="1">
         <w:r>
           <w:rPr>
             <w:rStyle w:val="Hyperlink"/>
@@ -2339,7 +2339,7 @@
         </w:rPr>
         <w:t xml:space="preserve">The </w:t>
       </w:r>
-      <w:hyperlink r:id="rId18">
+      <w:hyperlink r:id="rId18" w:history="1">
         <w:r>
           <w:rPr>
             <w:rStyle w:val="Hyperlink"/>
@@ -2357,7 +2357,7 @@
         </w:rPr>
         <w:t xml:space="preserve">, Gayogo̱hó:nǫʼ in their own language, are the People of the Great Swamp — one of the founding nations of the </w:t>
       </w:r>
-      <w:hyperlink r:id="rId19">
+      <w:hyperlink r:id="rId19" w:history="1">
         <w:r>
           <w:rPr>
             <w:rStyle w:val="Hyperlink"/>
@@ -2375,7 +2375,7 @@
         </w:rPr>
         <w:t xml:space="preserve">. They held the territory around Cayuga Lake for centuries, documented at </w:t>
       </w:r>
-      <w:hyperlink r:id="rId53">
+      <w:hyperlink r:id="rId53" w:history="1">
         <w:r>
           <w:rPr>
             <w:rStyle w:val="Hyperlink"/>
@@ -2393,7 +2393,7 @@
         </w:rPr>
         <w:t xml:space="preserve">, </w:t>
       </w:r>
-      <w:hyperlink r:id="rId12">
+      <w:hyperlink r:id="rId12" w:history="1">
         <w:r>
           <w:rPr>
             <w:rStyle w:val="Hyperlink"/>
@@ -2411,7 +2411,7 @@
         </w:rPr>
         <w:t xml:space="preserve">, Cayuga village, </w:t>
       </w:r>
-      <w:hyperlink r:id="rId11">
+      <w:hyperlink r:id="rId11" w:history="1">
         <w:r>
           <w:rPr>
             <w:rStyle w:val="Hyperlink"/>
@@ -2429,7 +2429,7 @@
         </w:rPr>
         <w:t xml:space="preserve">, and </w:t>
       </w:r>
-      <w:hyperlink r:id="rId9">
+      <w:hyperlink r:id="rId9" w:history="1">
         <w:r>
           <w:rPr>
             <w:rStyle w:val="Hyperlink"/>
@@ -2455,7 +2455,7 @@
         </w:rPr>
         <w:t xml:space="preserve">The </w:t>
       </w:r>
-      <w:hyperlink r:id="rId20">
+      <w:hyperlink r:id="rId20" w:history="1">
         <w:r>
           <w:rPr>
             <w:rStyle w:val="Hyperlink"/>
@@ -2473,7 +2473,7 @@
         </w:rPr>
         <w:t xml:space="preserve"> burned those towns in 1779. Washington's orders were explicit: total destruction, ruin the crops. The Cayuga were dispossessed under treaties negotiated in the 1790s that the Nation regards as illegitimate to this day. The lake still has their name. In 2005, a 70-acre farm in </w:t>
       </w:r>
-      <w:hyperlink r:id="rId12">
+      <w:hyperlink r:id="rId12" w:history="1">
         <w:r>
           <w:rPr>
             <w:rStyle w:val="Hyperlink"/>
@@ -2491,7 +2491,7 @@
         </w:rPr>
         <w:t xml:space="preserve"> — on the land of Chonodote itself — was signed over to the </w:t>
       </w:r>
-      <w:hyperlink r:id="rId18">
+      <w:hyperlink r:id="rId18" w:history="1">
         <w:r>
           <w:rPr>
             <w:rStyle w:val="Hyperlink"/>
@@ -2528,7 +2528,7 @@
         </w:rPr>
         <w:t xml:space="preserve">Map of the </w:t>
       </w:r>
-      <w:hyperlink r:id="rId20">
+      <w:hyperlink r:id="rId20" w:history="1">
         <w:r>
           <w:rPr>
             <w:rStyle w:val="Hyperlink"/>
@@ -2547,7 +2547,7 @@
         </w:rPr>
         <w:t xml:space="preserve">, 1779. Continental Army forces moved along Cayuga's western shore, burning the Cayuga towns including Chonodote at present-day </w:t>
       </w:r>
-      <w:hyperlink r:id="rId12">
+      <w:hyperlink r:id="rId12" w:history="1">
         <w:r>
           <w:rPr>
             <w:rStyle w:val="Hyperlink"/>
@@ -2579,7 +2579,7 @@
       </w:r>
     </w:p>
     <w:p>
-      <w:hyperlink r:id="rId17">
+      <w:hyperlink r:id="rId17" w:history="1">
         <w:r>
           <w:rPr>
             <w:rStyle w:val="Hyperlink"/>
@@ -2597,7 +2597,7 @@
         </w:rPr>
         <w:t xml:space="preserve"> chose </w:t>
       </w:r>
-      <w:hyperlink r:id="rId10">
+      <w:hyperlink r:id="rId10" w:history="1">
         <w:r>
           <w:rPr>
             <w:rStyle w:val="Hyperlink"/>
@@ -2615,7 +2615,7 @@
         </w:rPr>
         <w:t xml:space="preserve"> in 1859 because of what was already there: a Quaker abolitionist network, a sympathetic senator two blocks away, and proximity to the Canadian border routes she knew from conducting. She moved her aging parents from Canada and settled on a seven-acre farm at 180 South Street in </w:t>
       </w:r>
-      <w:hyperlink r:id="rId54">
+      <w:hyperlink r:id="rId54" w:history="1">
         <w:r>
           <w:rPr>
             <w:rStyle w:val="Hyperlink"/>
@@ -2633,7 +2633,7 @@
         </w:rPr>
         <w:t xml:space="preserve">, just outside the city line. The farm was sold to her by </w:t>
       </w:r>
-      <w:hyperlink r:id="rId31">
+      <w:hyperlink r:id="rId31" w:history="1">
         <w:r>
           <w:rPr>
             <w:rStyle w:val="Hyperlink"/>
@@ -2659,7 +2659,7 @@
         </w:rPr>
         <w:t xml:space="preserve">She spent 54 years in </w:t>
       </w:r>
-      <w:hyperlink r:id="rId10">
+      <w:hyperlink r:id="rId10" w:history="1">
         <w:r>
           <w:rPr>
             <w:rStyle w:val="Hyperlink"/>
@@ -2677,7 +2677,7 @@
         </w:rPr>
         <w:t xml:space="preserve"> after that — organizing, supporting civil rights and women's suffrage, caring for people who had nowhere else to go. In 1908 she built the Home for the Aged at 182 South Street, which she deeded to the Thompson AME Zion Church. She died there in 1913 at approximately 91. The grave at </w:t>
       </w:r>
-      <w:hyperlink r:id="rId55">
+      <w:hyperlink r:id="rId55" w:history="1">
         <w:r>
           <w:rPr>
             <w:rStyle w:val="Hyperlink"/>
@@ -2703,7 +2703,7 @@
         </w:rPr>
         <w:t xml:space="preserve">The </w:t>
       </w:r>
-      <w:hyperlink r:id="rId30">
+      <w:hyperlink r:id="rId30" w:history="1">
         <w:r>
           <w:rPr>
             <w:rStyle w:val="Hyperlink"/>
@@ -2734,7 +2734,7 @@
       </w:r>
     </w:p>
     <w:p>
-      <w:hyperlink r:id="rId31">
+      <w:hyperlink r:id="rId31" w:history="1">
         <w:r>
           <w:rPr>
             <w:rStyle w:val="Hyperlink"/>
@@ -2752,7 +2752,7 @@
         </w:rPr>
         <w:t xml:space="preserve"> served as New York Governor, U.S. Senator, and Secretary of State under both Lincoln and Johnson — the man who negotiated the purchase of Alaska, dismissed at the time as Seward's Folly. His house on South Street in </w:t>
       </w:r>
-      <w:hyperlink r:id="rId10">
+      <w:hyperlink r:id="rId10" w:history="1">
         <w:r>
           <w:rPr>
             <w:rStyle w:val="Hyperlink"/>
@@ -2770,7 +2770,7 @@
         </w:rPr>
         <w:t xml:space="preserve"> was a documented Underground Railroad stop, a meeting point for the reform networks, and the place where Seward privately arranged the land transaction with </w:t>
       </w:r>
-      <w:hyperlink r:id="rId17">
+      <w:hyperlink r:id="rId17" w:history="1">
         <w:r>
           <w:rPr>
             <w:rStyle w:val="Hyperlink"/>
@@ -2788,7 +2788,7 @@
         </w:rPr>
         <w:t xml:space="preserve">. </w:t>
       </w:r>
-      <w:hyperlink r:id="rId43">
+      <w:hyperlink r:id="rId43" w:history="1">
         <w:r>
           <w:rPr>
             <w:rStyle w:val="Hyperlink"/>
@@ -2806,7 +2806,7 @@
         </w:rPr>
         <w:t xml:space="preserve"> was a frequent visitor. The </w:t>
       </w:r>
-      <w:hyperlink r:id="rId52">
+      <w:hyperlink r:id="rId52" w:history="1">
         <w:r>
           <w:rPr>
             <w:rStyle w:val="Hyperlink"/>
@@ -2843,7 +2843,7 @@
         </w:rPr>
         <w:t xml:space="preserve">The </w:t>
       </w:r>
-      <w:hyperlink r:id="rId56">
+      <w:hyperlink r:id="rId56" w:history="1">
         <w:r>
           <w:rPr>
             <w:rStyle w:val="Hyperlink"/>
@@ -2861,7 +2861,7 @@
         </w:rPr>
         <w:t xml:space="preserve"> on Nelson Street in </w:t>
       </w:r>
-      <w:hyperlink r:id="rId10">
+      <w:hyperlink r:id="rId10" w:history="1">
         <w:r>
           <w:rPr>
             <w:rStyle w:val="Hyperlink"/>
@@ -2879,7 +2879,7 @@
         </w:rPr>
         <w:t xml:space="preserve"> is the only complete, unaltered </w:t>
       </w:r>
-      <w:hyperlink r:id="rId57">
+      <w:hyperlink r:id="rId57" w:history="1">
         <w:r>
           <w:rPr>
             <w:rStyle w:val="Hyperlink"/>
@@ -2897,7 +2897,7 @@
         </w:rPr>
         <w:t xml:space="preserve"> interior remaining in the United States. Tiffany did the entire space in 1894 — the glass, the tiles, the metalwork, the furnishings. Everything. It survived because it was attached to an institution that closed and transferred ownership carefully rather than demolishing. Most people driving through </w:t>
       </w:r>
-      <w:hyperlink r:id="rId10">
+      <w:hyperlink r:id="rId10" w:history="1">
         <w:r>
           <w:rPr>
             <w:rStyle w:val="Hyperlink"/>
@@ -2934,7 +2934,7 @@
         </w:rPr>
         <w:t xml:space="preserve">The </w:t>
       </w:r>
-      <w:hyperlink r:id="rId56">
+      <w:hyperlink r:id="rId56" w:history="1">
         <w:r>
           <w:rPr>
             <w:rStyle w:val="Hyperlink"/>
@@ -2953,7 +2953,7 @@
         </w:rPr>
         <w:t xml:space="preserve">, </w:t>
       </w:r>
-      <w:hyperlink r:id="rId10">
+      <w:hyperlink r:id="rId10" w:history="1">
         <w:r>
           <w:rPr>
             <w:rStyle w:val="Hyperlink"/>
@@ -2972,7 +2972,7 @@
         </w:rPr>
         <w:t xml:space="preserve">. The only complete, unaltered </w:t>
       </w:r>
-      <w:hyperlink r:id="rId57">
+      <w:hyperlink r:id="rId57" w:history="1">
         <w:r>
           <w:rPr>
             <w:rStyle w:val="Hyperlink"/>
@@ -3003,7 +3003,7 @@
       </w:r>
     </w:p>
     <w:p>
-      <w:hyperlink r:id="rId42">
+      <w:hyperlink r:id="rId42" w:history="1">
         <w:r>
           <w:rPr>
             <w:rStyle w:val="Hyperlink"/>
@@ -3022,7 +3022,7 @@
         </w:rPr>
         <w:t xml:space="preserve">, c. 1870. Primary author of the Declaration of Sentiments. She lived in </w:t>
       </w:r>
-      <w:hyperlink r:id="rId11">
+      <w:hyperlink r:id="rId11" w:history="1">
         <w:r>
           <w:rPr>
             <w:rStyle w:val="Hyperlink"/>
@@ -3061,7 +3061,7 @@
         </w:rPr>
         <w:t xml:space="preserve">Badge track: All sites below are tagged to the </w:t>
       </w:r>
-      <w:hyperlink r:id="rId58">
+      <w:hyperlink r:id="rId58" w:history="1">
         <w:r>
           <w:rPr>
             <w:rStyle w:val="Hyperlink"/>
@@ -3088,7 +3088,7 @@
         </w:rPr>
         <w:t xml:space="preserve">— </w:t>
       </w:r>
-      <w:hyperlink r:id="rId30">
+      <w:hyperlink r:id="rId30" w:history="1">
         <w:r>
           <w:rPr>
             <w:rStyle w:val="Hyperlink"/>
@@ -3106,7 +3106,7 @@
         </w:rPr>
         <w:t xml:space="preserve"> </w:t>
       </w:r>
-      <w:hyperlink r:id="rId59">
+      <w:hyperlink r:id="rId59" w:history="1">
         <w:r>
           <w:rPr>
             <w:rStyle w:val="Hyperlink"/>
@@ -3145,7 +3145,7 @@
         </w:rPr>
         <w:t xml:space="preserve"> </w:t>
       </w:r>
-      <w:hyperlink r:id="rId55">
+      <w:hyperlink r:id="rId55" w:history="1">
         <w:r>
           <w:rPr>
             <w:rStyle w:val="Hyperlink"/>
@@ -3171,7 +3171,7 @@
         </w:rPr>
         <w:t xml:space="preserve">— </w:t>
       </w:r>
-      <w:hyperlink r:id="rId52">
+      <w:hyperlink r:id="rId52" w:history="1">
         <w:r>
           <w:rPr>
             <w:rStyle w:val="Hyperlink"/>
@@ -3189,7 +3189,7 @@
         </w:rPr>
         <w:t xml:space="preserve"> </w:t>
       </w:r>
-      <w:hyperlink r:id="rId60">
+      <w:hyperlink r:id="rId60" w:history="1">
         <w:r>
           <w:rPr>
             <w:rStyle w:val="Hyperlink"/>
@@ -3228,7 +3228,7 @@
         </w:rPr>
         <w:t xml:space="preserve"> </w:t>
       </w:r>
-      <w:hyperlink r:id="rId32">
+      <w:hyperlink r:id="rId32" w:history="1">
         <w:r>
           <w:rPr>
             <w:rStyle w:val="Hyperlink"/>
@@ -3267,7 +3267,7 @@
         </w:rPr>
         <w:t xml:space="preserve"> </w:t>
       </w:r>
-      <w:hyperlink r:id="rId56">
+      <w:hyperlink r:id="rId56" w:history="1">
         <w:r>
           <w:rPr>
             <w:rStyle w:val="Hyperlink"/>
@@ -3293,7 +3293,7 @@
         </w:rPr>
         <w:t xml:space="preserve">— </w:t>
       </w:r>
-      <w:hyperlink r:id="rId46">
+      <w:hyperlink r:id="rId46" w:history="1">
         <w:r>
           <w:rPr>
             <w:rStyle w:val="Hyperlink"/>
@@ -3311,7 +3311,7 @@
         </w:rPr>
         <w:t xml:space="preserve"> </w:t>
       </w:r>
-      <w:hyperlink r:id="rId61">
+      <w:hyperlink r:id="rId61" w:history="1">
         <w:r>
           <w:rPr>
             <w:rStyle w:val="Hyperlink"/>
@@ -3350,7 +3350,7 @@
         </w:rPr>
         <w:t xml:space="preserve"> </w:t>
       </w:r>
-      <w:hyperlink r:id="rId62">
+      <w:hyperlink r:id="rId62" w:history="1">
         <w:r>
           <w:rPr>
             <w:rStyle w:val="Hyperlink"/>
@@ -3389,7 +3389,7 @@
         </w:rPr>
         <w:t xml:space="preserve"> </w:t>
       </w:r>
-      <w:hyperlink r:id="rId63">
+      <w:hyperlink r:id="rId63" w:history="1">
         <w:r>
           <w:rPr>
             <w:rStyle w:val="Hyperlink"/>
@@ -3415,7 +3415,7 @@
         </w:rPr>
         <w:t xml:space="preserve">— </w:t>
       </w:r>
-      <w:hyperlink r:id="rId64">
+      <w:hyperlink r:id="rId64" w:history="1">
         <w:r>
           <w:rPr>
             <w:rStyle w:val="Hyperlink"/>
@@ -3433,7 +3433,7 @@
         </w:rPr>
         <w:t xml:space="preserve"> </w:t>
       </w:r>
-      <w:hyperlink r:id="rId65">
+      <w:hyperlink r:id="rId65" w:history="1">
         <w:r>
           <w:rPr>
             <w:rStyle w:val="Hyperlink"/>
@@ -3472,7 +3472,7 @@
         </w:rPr>
         <w:t xml:space="preserve"> </w:t>
       </w:r>
-      <w:hyperlink r:id="rId66">
+      <w:hyperlink r:id="rId66" w:history="1">
         <w:r>
           <w:rPr>
             <w:rStyle w:val="Hyperlink"/>
@@ -3509,7 +3509,7 @@
         </w:rPr>
         <w:t xml:space="preserve">The </w:t>
       </w:r>
-      <w:hyperlink r:id="rId21">
+      <w:hyperlink r:id="rId21" w:history="1">
         <w:r>
           <w:rPr>
             <w:rStyle w:val="Hyperlink"/>
@@ -3535,7 +3535,7 @@
         </w:rPr>
         <w:t xml:space="preserve">What distinguishes Cayuga from Seneca: higher elevation, steeper shale slopes, and a slightly more austere expression in the Riesling — more linear and mineral, more transparently terroir-driven. The east shore in particular produces Rieslings that invite serious comparison with the wines they were modeled after in the </w:t>
       </w:r>
-      <w:hyperlink r:id="rId67">
+      <w:hyperlink r:id="rId67" w:history="1">
         <w:r>
           <w:rPr>
             <w:rStyle w:val="Hyperlink"/>
@@ -3565,7 +3565,7 @@
       </w:r>
     </w:p>
     <w:p>
-      <w:hyperlink r:id="rId21">
+      <w:hyperlink r:id="rId21" w:history="1">
         <w:r>
           <w:rPr>
             <w:rStyle w:val="Hyperlink"/>
@@ -3603,7 +3603,7 @@
         </w:rPr>
         <w:t xml:space="preserve">— </w:t>
       </w:r>
-      <w:hyperlink r:id="rId50">
+      <w:hyperlink r:id="rId50" w:history="1">
         <w:r>
           <w:rPr>
             <w:rStyle w:val="Hyperlink"/>
@@ -3621,7 +3621,7 @@
         </w:rPr>
         <w:t xml:space="preserve"> </w:t>
       </w:r>
-      <w:hyperlink r:id="rId68">
+      <w:hyperlink r:id="rId68" w:history="1">
         <w:r>
           <w:rPr>
             <w:rStyle w:val="Hyperlink"/>
@@ -3647,7 +3647,7 @@
         </w:rPr>
         <w:t xml:space="preserve">— </w:t>
       </w:r>
-      <w:hyperlink r:id="rId69">
+      <w:hyperlink r:id="rId69" w:history="1">
         <w:r>
           <w:rPr>
             <w:rStyle w:val="Hyperlink"/>
@@ -3665,7 +3665,7 @@
         </w:rPr>
         <w:t xml:space="preserve"> </w:t>
       </w:r>
-      <w:hyperlink r:id="rId70">
+      <w:hyperlink r:id="rId70" w:history="1">
         <w:r>
           <w:rPr>
             <w:rStyle w:val="Hyperlink"/>
@@ -3691,7 +3691,7 @@
         </w:rPr>
         <w:t xml:space="preserve">— </w:t>
       </w:r>
-      <w:hyperlink r:id="rId71">
+      <w:hyperlink r:id="rId71" w:history="1">
         <w:r>
           <w:rPr>
             <w:rStyle w:val="Hyperlink"/>
@@ -3709,7 +3709,7 @@
         </w:rPr>
         <w:t xml:space="preserve"> </w:t>
       </w:r>
-      <w:hyperlink r:id="rId72">
+      <w:hyperlink r:id="rId72" w:history="1">
         <w:r>
           <w:rPr>
             <w:rStyle w:val="Hyperlink"/>
@@ -3735,7 +3735,7 @@
         </w:rPr>
         <w:t xml:space="preserve">— </w:t>
       </w:r>
-      <w:hyperlink r:id="rId73">
+      <w:hyperlink r:id="rId73" w:history="1">
         <w:r>
           <w:rPr>
             <w:rStyle w:val="Hyperlink"/>
@@ -3753,7 +3753,7 @@
         </w:rPr>
         <w:t xml:space="preserve"> </w:t>
       </w:r>
-      <w:hyperlink r:id="rId74">
+      <w:hyperlink r:id="rId74" w:history="1">
         <w:r>
           <w:rPr>
             <w:rStyle w:val="Hyperlink"/>
@@ -3779,7 +3779,7 @@
         </w:rPr>
         <w:t xml:space="preserve">— </w:t>
       </w:r>
-      <w:hyperlink r:id="rId75">
+      <w:hyperlink r:id="rId75" w:history="1">
         <w:r>
           <w:rPr>
             <w:rStyle w:val="Hyperlink"/>
@@ -3797,7 +3797,7 @@
         </w:rPr>
         <w:t xml:space="preserve"> </w:t>
       </w:r>
-      <w:hyperlink r:id="rId76">
+      <w:hyperlink r:id="rId76" w:history="1">
         <w:r>
           <w:rPr>
             <w:rStyle w:val="Hyperlink"/>
@@ -3823,7 +3823,7 @@
         </w:rPr>
         <w:t xml:space="preserve">— </w:t>
       </w:r>
-      <w:hyperlink r:id="rId77">
+      <w:hyperlink r:id="rId77" w:history="1">
         <w:r>
           <w:rPr>
             <w:rStyle w:val="Hyperlink"/>
@@ -3841,7 +3841,7 @@
         </w:rPr>
         <w:t xml:space="preserve"> </w:t>
       </w:r>
-      <w:hyperlink r:id="rId78">
+      <w:hyperlink r:id="rId78" w:history="1">
         <w:r>
           <w:rPr>
             <w:rStyle w:val="Hyperlink"/>
@@ -3867,7 +3867,7 @@
         </w:rPr>
         <w:t xml:space="preserve">— </w:t>
       </w:r>
-      <w:hyperlink r:id="rId79">
+      <w:hyperlink r:id="rId79" w:history="1">
         <w:r>
           <w:rPr>
             <w:rStyle w:val="Hyperlink"/>
@@ -3885,7 +3885,7 @@
         </w:rPr>
         <w:t xml:space="preserve"> </w:t>
       </w:r>
-      <w:hyperlink r:id="rId80">
+      <w:hyperlink r:id="rId80" w:history="1">
         <w:r>
           <w:rPr>
             <w:rStyle w:val="Hyperlink"/>
@@ -3911,7 +3911,7 @@
         </w:rPr>
         <w:t xml:space="preserve">— </w:t>
       </w:r>
-      <w:hyperlink r:id="rId81">
+      <w:hyperlink r:id="rId81" w:history="1">
         <w:r>
           <w:rPr>
             <w:rStyle w:val="Hyperlink"/>
@@ -3929,7 +3929,7 @@
         </w:rPr>
         <w:t xml:space="preserve"> </w:t>
       </w:r>
-      <w:hyperlink r:id="rId82">
+      <w:hyperlink r:id="rId82" w:history="1">
         <w:r>
           <w:rPr>
             <w:rStyle w:val="Hyperlink"/>
@@ -3966,7 +3966,7 @@
         </w:rPr>
         <w:t xml:space="preserve">The standard west-shore loop runs Route 89 from </w:t>
       </w:r>
-      <w:hyperlink r:id="rId9">
+      <w:hyperlink r:id="rId9" w:history="1">
         <w:r>
           <w:rPr>
             <w:rStyle w:val="Hyperlink"/>
@@ -3984,7 +3984,7 @@
         </w:rPr>
         <w:t xml:space="preserve"> north to Cayuga village. A full circuit takes two days done properly — one shore per day, with a night in </w:t>
       </w:r>
-      <w:hyperlink r:id="rId9">
+      <w:hyperlink r:id="rId9" w:history="1">
         <w:r>
           <w:rPr>
             <w:rStyle w:val="Hyperlink"/>
@@ -4002,7 +4002,7 @@
         </w:rPr>
         <w:t xml:space="preserve"> or </w:t>
       </w:r>
-      <w:hyperlink r:id="rId12">
+      <w:hyperlink r:id="rId12" w:history="1">
         <w:r>
           <w:rPr>
             <w:rStyle w:val="Hyperlink"/>
@@ -4039,7 +4039,7 @@
         </w:rPr>
         <w:t xml:space="preserve">The </w:t>
       </w:r>
-      <w:hyperlink r:id="rId48">
+      <w:hyperlink r:id="rId48" w:history="1">
         <w:r>
           <w:rPr>
             <w:rStyle w:val="Hyperlink"/>
@@ -4057,7 +4057,7 @@
         </w:rPr>
         <w:t xml:space="preserve"> at </w:t>
       </w:r>
-      <w:hyperlink r:id="rId49">
+      <w:hyperlink r:id="rId49" w:history="1">
         <w:r>
           <w:rPr>
             <w:rStyle w:val="Hyperlink"/>
@@ -4075,7 +4075,7 @@
         </w:rPr>
         <w:t xml:space="preserve"> sits on Cayuga's western shore outside </w:t>
       </w:r>
-      <w:hyperlink r:id="rId83">
+      <w:hyperlink r:id="rId83" w:history="1">
         <w:r>
           <w:rPr>
             <w:rStyle w:val="Hyperlink"/>
@@ -4093,7 +4093,7 @@
         </w:rPr>
         <w:t xml:space="preserve"> — four cideries under one roof, a working organic farm, food sourced from the neighboring properties. Two miles south, </w:t>
       </w:r>
-      <w:hyperlink r:id="rId84">
+      <w:hyperlink r:id="rId84" w:history="1">
         <w:r>
           <w:rPr>
             <w:rStyle w:val="Hyperlink"/>
@@ -4111,7 +4111,7 @@
         </w:rPr>
         <w:t xml:space="preserve"> has been making goat cheese in </w:t>
       </w:r>
-      <w:hyperlink r:id="rId40">
+      <w:hyperlink r:id="rId40" w:history="1">
         <w:r>
           <w:rPr>
             <w:rStyle w:val="Hyperlink"/>
@@ -4129,7 +4129,7 @@
         </w:rPr>
         <w:t xml:space="preserve"> since 1982. These two stops, with the farm stands along Route 89, constitute what the itinerary calls the </w:t>
       </w:r>
-      <w:hyperlink r:id="rId85">
+      <w:hyperlink r:id="rId85" w:history="1">
         <w:r>
           <w:rPr>
             <w:rStyle w:val="Hyperlink"/>
@@ -4159,7 +4159,7 @@
       </w:r>
     </w:p>
     <w:p>
-      <w:hyperlink r:id="rId48">
+      <w:hyperlink r:id="rId48" w:history="1">
         <w:r>
           <w:rPr>
             <w:rStyle w:val="Hyperlink"/>
@@ -4178,7 +4178,7 @@
         </w:rPr>
         <w:t xml:space="preserve"> at </w:t>
       </w:r>
-      <w:hyperlink r:id="rId49">
+      <w:hyperlink r:id="rId49" w:history="1">
         <w:r>
           <w:rPr>
             <w:rStyle w:val="Hyperlink"/>
@@ -4197,7 +4197,7 @@
         </w:rPr>
         <w:t xml:space="preserve">, </w:t>
       </w:r>
-      <w:hyperlink r:id="rId40">
+      <w:hyperlink r:id="rId40" w:history="1">
         <w:r>
           <w:rPr>
             <w:rStyle w:val="Hyperlink"/>
@@ -4224,7 +4224,7 @@
         </w:rPr>
         <w:t xml:space="preserve">The </w:t>
       </w:r>
-      <w:hyperlink r:id="rId86">
+      <w:hyperlink r:id="rId86" w:history="1">
         <w:r>
           <w:rPr>
             <w:rStyle w:val="Hyperlink"/>
@@ -4242,7 +4242,7 @@
         </w:rPr>
         <w:t xml:space="preserve"> Saturday and Sunday at </w:t>
       </w:r>
-      <w:hyperlink r:id="rId87">
+      <w:hyperlink r:id="rId87" w:history="1">
         <w:r>
           <w:rPr>
             <w:rStyle w:val="Hyperlink"/>
@@ -4272,7 +4272,7 @@
       </w:r>
     </w:p>
     <w:p>
-      <w:hyperlink r:id="rId86">
+      <w:hyperlink r:id="rId86" w:history="1">
         <w:r>
           <w:rPr>
             <w:rStyle w:val="Hyperlink"/>
@@ -4291,7 +4291,7 @@
         </w:rPr>
         <w:t xml:space="preserve">, </w:t>
       </w:r>
-      <w:hyperlink r:id="rId87">
+      <w:hyperlink r:id="rId87" w:history="1">
         <w:r>
           <w:rPr>
             <w:rStyle w:val="Hyperlink"/>
@@ -4682,7 +4682,7 @@
         </w:rPr>
         <w:t xml:space="preserve">More than 150 waterfalls within ten miles of downtown </w:t>
       </w:r>
-      <w:hyperlink r:id="rId9">
+      <w:hyperlink r:id="rId9" w:history="1">
         <w:r>
           <w:rPr>
             <w:rStyle w:val="Hyperlink"/>
@@ -4700,7 +4700,7 @@
         </w:rPr>
         <w:t xml:space="preserve">. The standard recommendation is </w:t>
       </w:r>
-      <w:hyperlink r:id="rId47">
+      <w:hyperlink r:id="rId47" w:history="1">
         <w:r>
           <w:rPr>
             <w:rStyle w:val="Hyperlink"/>
@@ -4730,7 +4730,7 @@
       </w:r>
     </w:p>
     <w:p>
-      <w:hyperlink r:id="rId47">
+      <w:hyperlink r:id="rId47" w:history="1">
         <w:r>
           <w:rPr>
             <w:rStyle w:val="Hyperlink"/>
@@ -4749,7 +4749,7 @@
         </w:rPr>
         <w:t xml:space="preserve">, </w:t>
       </w:r>
-      <w:hyperlink r:id="rId83">
+      <w:hyperlink r:id="rId83" w:history="1">
         <w:r>
           <w:rPr>
             <w:rStyle w:val="Hyperlink"/>
@@ -4787,7 +4787,7 @@
         </w:rPr>
         <w:t xml:space="preserve">Two miles north of </w:t>
       </w:r>
-      <w:hyperlink r:id="rId83">
+      <w:hyperlink r:id="rId83" w:history="1">
         <w:r>
           <w:rPr>
             <w:rStyle w:val="Hyperlink"/>
@@ -4805,7 +4805,7 @@
         </w:rPr>
         <w:t xml:space="preserve"> on Route 89. Flat gorge trail to the base of the falls. Swimming area and marina on the lake, summer concert series. The Black Diamond Trail runs from Taughannock south to the Cayuga Waterfront Trail in </w:t>
       </w:r>
-      <w:hyperlink r:id="rId9">
+      <w:hyperlink r:id="rId9" w:history="1">
         <w:r>
           <w:rPr>
             <w:rStyle w:val="Hyperlink"/>
@@ -4842,7 +4842,7 @@
         </w:rPr>
         <w:t xml:space="preserve">Both within five miles south of downtown </w:t>
       </w:r>
-      <w:hyperlink r:id="rId9">
+      <w:hyperlink r:id="rId9" w:history="1">
         <w:r>
           <w:rPr>
             <w:rStyle w:val="Hyperlink"/>
@@ -4860,7 +4860,7 @@
         </w:rPr>
         <w:t xml:space="preserve">. </w:t>
       </w:r>
-      <w:hyperlink r:id="rId88">
+      <w:hyperlink r:id="rId88" w:history="1">
         <w:r>
           <w:rPr>
             <w:rStyle w:val="Hyperlink"/>
@@ -4878,7 +4878,7 @@
         </w:rPr>
         <w:t xml:space="preserve"> has a natural swimming pool at the base — cold, clear. </w:t>
       </w:r>
-      <w:hyperlink r:id="rId89">
+      <w:hyperlink r:id="rId89" w:history="1">
         <w:r>
           <w:rPr>
             <w:rStyle w:val="Hyperlink"/>
@@ -4896,7 +4896,7 @@
         </w:rPr>
         <w:t xml:space="preserve">'s Enfield Glen contains 12 waterfalls including the 115-foot Lucifer Falls. Together they form the core of a half-day loop from </w:t>
       </w:r>
-      <w:hyperlink r:id="rId9">
+      <w:hyperlink r:id="rId9" w:history="1">
         <w:r>
           <w:rPr>
             <w:rStyle w:val="Hyperlink"/>
@@ -4933,7 +4933,7 @@
         </w:rPr>
         <w:t xml:space="preserve">Runs from downtown </w:t>
       </w:r>
-      <w:hyperlink r:id="rId9">
+      <w:hyperlink r:id="rId9" w:history="1">
         <w:r>
           <w:rPr>
             <w:rStyle w:val="Hyperlink"/>
@@ -4951,7 +4951,7 @@
         </w:rPr>
         <w:t xml:space="preserve"> up to the </w:t>
       </w:r>
-      <w:hyperlink r:id="rId35">
+      <w:hyperlink r:id="rId35" w:history="1">
         <w:r>
           <w:rPr>
             <w:rStyle w:val="Hyperlink"/>
@@ -4969,7 +4969,7 @@
         </w:rPr>
         <w:t xml:space="preserve"> campus — 400 feet of elevation through layered Devonian shale, six waterfalls, stone staircases from the 1920s. For some </w:t>
       </w:r>
-      <w:hyperlink r:id="rId35">
+      <w:hyperlink r:id="rId35" w:history="1">
         <w:r>
           <w:rPr>
             <w:rStyle w:val="Hyperlink"/>
@@ -5018,7 +5018,7 @@
       </w:r>
     </w:p>
     <w:p>
-      <w:hyperlink r:id="rId90">
+      <w:hyperlink r:id="rId90" w:history="1">
         <w:r>
           <w:rPr>
             <w:rStyle w:val="Hyperlink"/>
@@ -5046,7 +5046,7 @@
         </w:rPr>
         <w:t xml:space="preserve">Named sites: </w:t>
       </w:r>
-      <w:hyperlink r:id="rId91">
+      <w:hyperlink r:id="rId91" w:history="1">
         <w:r>
           <w:rPr>
             <w:rStyle w:val="Hyperlink"/>
@@ -5064,7 +5064,7 @@
         </w:rPr>
         <w:t xml:space="preserve"> · </w:t>
       </w:r>
-      <w:hyperlink r:id="rId88">
+      <w:hyperlink r:id="rId88" w:history="1">
         <w:r>
           <w:rPr>
             <w:rStyle w:val="Hyperlink"/>
@@ -5082,7 +5082,7 @@
         </w:rPr>
         <w:t xml:space="preserve"> · </w:t>
       </w:r>
-      <w:hyperlink r:id="rId89">
+      <w:hyperlink r:id="rId89" w:history="1">
         <w:r>
           <w:rPr>
             <w:rStyle w:val="Hyperlink"/>
@@ -5100,7 +5100,7 @@
         </w:rPr>
         <w:t xml:space="preserve"> · </w:t>
       </w:r>
-      <w:hyperlink r:id="rId37">
+      <w:hyperlink r:id="rId37" w:history="1">
         <w:r>
           <w:rPr>
             <w:rStyle w:val="Hyperlink"/>
@@ -5118,7 +5118,7 @@
         </w:rPr>
         <w:t xml:space="preserve"> · </w:t>
       </w:r>
-      <w:hyperlink r:id="rId34">
+      <w:hyperlink r:id="rId34" w:history="1">
         <w:r>
           <w:rPr>
             <w:rStyle w:val="Hyperlink"/>
@@ -5136,7 +5136,7 @@
         </w:rPr>
         <w:t xml:space="preserve"> · </w:t>
       </w:r>
-      <w:hyperlink r:id="rId90">
+      <w:hyperlink r:id="rId90" w:history="1">
         <w:r>
           <w:rPr>
             <w:rStyle w:val="Hyperlink"/>
@@ -5161,7 +5161,7 @@
       </w:r>
     </w:p>
     <w:p>
-      <w:hyperlink r:id="rId28">
+      <w:hyperlink r:id="rId28" w:history="1">
         <w:r>
           <w:rPr>
             <w:rStyle w:val="Hyperlink"/>
@@ -5179,7 +5179,7 @@
         </w:rPr>
         <w:t xml:space="preserve"> · </w:t>
       </w:r>
-      <w:hyperlink r:id="rId92">
+      <w:hyperlink r:id="rId92" w:history="1">
         <w:r>
           <w:rPr>
             <w:rStyle w:val="Hyperlink"/>
@@ -5198,7 +5198,7 @@
       </w:r>
     </w:p>
     <w:p>
-      <w:hyperlink r:id="rId93">
+      <w:hyperlink r:id="rId93" w:history="1">
         <w:r>
           <w:rPr>
             <w:rStyle w:val="Hyperlink"/>
@@ -5216,7 +5216,7 @@
         </w:rPr>
         <w:t xml:space="preserve"> · </w:t>
       </w:r>
-      <w:hyperlink r:id="rId94">
+      <w:hyperlink r:id="rId94" w:history="1">
         <w:r>
           <w:rPr>
             <w:rStyle w:val="Hyperlink"/>
@@ -5235,7 +5235,7 @@
       </w:r>
     </w:p>
     <w:p>
-      <w:hyperlink r:id="rId95">
+      <w:hyperlink r:id="rId95" w:history="1">
         <w:r>
           <w:rPr>
             <w:rStyle w:val="Hyperlink"/>
@@ -5253,7 +5253,7 @@
         </w:rPr>
         <w:t xml:space="preserve"> · </w:t>
       </w:r>
-      <w:hyperlink r:id="rId96">
+      <w:hyperlink r:id="rId96" w:history="1">
         <w:r>
           <w:rPr>
             <w:rStyle w:val="Hyperlink"/>
@@ -5272,7 +5272,7 @@
       </w:r>
     </w:p>
     <w:p>
-      <w:hyperlink r:id="rId97">
+      <w:hyperlink r:id="rId97" w:history="1">
         <w:r>
           <w:rPr>
             <w:rStyle w:val="Hyperlink"/>
@@ -5290,7 +5290,7 @@
         </w:rPr>
         <w:t xml:space="preserve"> · </w:t>
       </w:r>
-      <w:hyperlink r:id="rId98">
+      <w:hyperlink r:id="rId98" w:history="1">
         <w:r>
           <w:rPr>
             <w:rStyle w:val="Hyperlink"/>
@@ -5309,7 +5309,7 @@
       </w:r>
     </w:p>
     <w:p>
-      <w:hyperlink r:id="rId99">
+      <w:hyperlink r:id="rId99" w:history="1">
         <w:r>
           <w:rPr>
             <w:rStyle w:val="Hyperlink"/>
@@ -5327,7 +5327,7 @@
         </w:rPr>
         <w:t xml:space="preserve"> · </w:t>
       </w:r>
-      <w:hyperlink r:id="rId100">
+      <w:hyperlink r:id="rId100" w:history="1">
         <w:r>
           <w:rPr>
             <w:rStyle w:val="Hyperlink"/>
@@ -5346,7 +5346,7 @@
       </w:r>
     </w:p>
     <w:p>
-      <w:hyperlink r:id="rId101">
+      <w:hyperlink r:id="rId101" w:history="1">
         <w:r>
           <w:rPr>
             <w:rStyle w:val="Hyperlink"/>
@@ -5364,7 +5364,7 @@
         </w:rPr>
         <w:t xml:space="preserve"> · </w:t>
       </w:r>
-      <w:hyperlink r:id="rId102">
+      <w:hyperlink r:id="rId102" w:history="1">
         <w:r>
           <w:rPr>
             <w:rStyle w:val="Hyperlink"/>
@@ -5400,7 +5400,7 @@
         </w:rPr>
         <w:t xml:space="preserve">Cayuga Lake requires a car. </w:t>
       </w:r>
-      <w:hyperlink r:id="rId103">
+      <w:hyperlink r:id="rId103" w:history="1">
         <w:r>
           <w:rPr>
             <w:rStyle w:val="Hyperlink"/>
@@ -5418,7 +5418,7 @@
         </w:rPr>
         <w:t xml:space="preserve"> has limited routes. </w:t>
       </w:r>
-      <w:hyperlink r:id="rId104">
+      <w:hyperlink r:id="rId104" w:history="1">
         <w:r>
           <w:rPr>
             <w:rStyle w:val="Hyperlink"/>
@@ -5745,7 +5745,7 @@
         </w:rPr>
         <w:t xml:space="preserve">Route 89 runs the west shore from </w:t>
       </w:r>
-      <w:hyperlink r:id="rId9">
+      <w:hyperlink r:id="rId9" w:history="1">
         <w:r>
           <w:rPr>
             <w:rStyle w:val="Hyperlink"/>
@@ -5763,7 +5763,7 @@
         </w:rPr>
         <w:t xml:space="preserve"> north through </w:t>
       </w:r>
-      <w:hyperlink r:id="rId83">
+      <w:hyperlink r:id="rId83" w:history="1">
         <w:r>
           <w:rPr>
             <w:rStyle w:val="Hyperlink"/>
@@ -5781,7 +5781,7 @@
         </w:rPr>
         <w:t xml:space="preserve">, </w:t>
       </w:r>
-      <w:hyperlink r:id="rId40">
+      <w:hyperlink r:id="rId40" w:history="1">
         <w:r>
           <w:rPr>
             <w:rStyle w:val="Hyperlink"/>
@@ -5799,7 +5799,7 @@
         </w:rPr>
         <w:t xml:space="preserve">, and </w:t>
       </w:r>
-      <w:hyperlink r:id="rId105">
+      <w:hyperlink r:id="rId105" w:history="1">
         <w:r>
           <w:rPr>
             <w:rStyle w:val="Hyperlink"/>
@@ -5817,7 +5817,7 @@
         </w:rPr>
         <w:t xml:space="preserve"> — primary wine trail loop, farm corridor, farm stands June through October. Route 90 runs the east shore — </w:t>
       </w:r>
-      <w:hyperlink r:id="rId12">
+      <w:hyperlink r:id="rId12" w:history="1">
         <w:r>
           <w:rPr>
             <w:rStyle w:val="Hyperlink"/>
@@ -5835,7 +5835,7 @@
         </w:rPr>
         <w:t xml:space="preserve">, </w:t>
       </w:r>
-      <w:hyperlink r:id="rId106">
+      <w:hyperlink r:id="rId106" w:history="1">
         <w:r>
           <w:rPr>
             <w:rStyle w:val="Hyperlink"/>
@@ -5853,7 +5853,7 @@
         </w:rPr>
         <w:t xml:space="preserve">, </w:t>
       </w:r>
-      <w:hyperlink r:id="rId53">
+      <w:hyperlink r:id="rId53" w:history="1">
         <w:r>
           <w:rPr>
             <w:rStyle w:val="Hyperlink"/>
@@ -5890,7 +5890,7 @@
         </w:rPr>
         <w:t xml:space="preserve">Wine trail tasting rooms: full hours May through November, reduced or closed December through April — call ahead. Farmers Market: Saturday April through December, Sunday May through November. Gorge trails best May through October; </w:t>
       </w:r>
-      <w:hyperlink r:id="rId90">
+      <w:hyperlink r:id="rId90" w:history="1">
         <w:r>
           <w:rPr>
             <w:rStyle w:val="Hyperlink"/>
@@ -5934,7 +5934,7 @@
         </w:rPr>
         <w:t xml:space="preserve">21 producers tagged to the </w:t>
       </w:r>
-      <w:hyperlink r:id="rId21">
+      <w:hyperlink r:id="rId21" w:history="1">
         <w:r>
           <w:rPr>
             <w:rStyle w:val="Hyperlink"/>
@@ -5961,7 +5961,7 @@
         </w:rPr>
         <w:t xml:space="preserve">Heritage stamps: </w:t>
       </w:r>
-      <w:hyperlink r:id="rId30">
+      <w:hyperlink r:id="rId30" w:history="1">
         <w:r>
           <w:rPr>
             <w:rStyle w:val="Hyperlink"/>
@@ -5979,7 +5979,7 @@
         </w:rPr>
         <w:t xml:space="preserve">, </w:t>
       </w:r>
-      <w:hyperlink r:id="rId52">
+      <w:hyperlink r:id="rId52" w:history="1">
         <w:r>
           <w:rPr>
             <w:rStyle w:val="Hyperlink"/>
@@ -6021,7 +6021,7 @@
         </w:rPr>
         <w:t xml:space="preserve">, </w:t>
       </w:r>
-      <w:hyperlink r:id="rId46">
+      <w:hyperlink r:id="rId46" w:history="1">
         <w:r>
           <w:rPr>
             <w:rStyle w:val="Hyperlink"/>
@@ -6063,7 +6063,7 @@
         </w:rPr>
         <w:t xml:space="preserve"> — all </w:t>
       </w:r>
-      <w:hyperlink r:id="rId58">
+      <w:hyperlink r:id="rId58" w:history="1">
         <w:r>
           <w:rPr>
             <w:rStyle w:val="Hyperlink"/>
@@ -6090,7 +6090,7 @@
         </w:rPr>
         <w:t xml:space="preserve">Nature stamps: </w:t>
       </w:r>
-      <w:hyperlink r:id="rId91">
+      <w:hyperlink r:id="rId91" w:history="1">
         <w:r>
           <w:rPr>
             <w:rStyle w:val="Hyperlink"/>
@@ -6108,7 +6108,7 @@
         </w:rPr>
         <w:t xml:space="preserve">, </w:t>
       </w:r>
-      <w:hyperlink r:id="rId88">
+      <w:hyperlink r:id="rId88" w:history="1">
         <w:r>
           <w:rPr>
             <w:rStyle w:val="Hyperlink"/>
@@ -6126,7 +6126,7 @@
         </w:rPr>
         <w:t xml:space="preserve">, </w:t>
       </w:r>
-      <w:hyperlink r:id="rId89">
+      <w:hyperlink r:id="rId89" w:history="1">
         <w:r>
           <w:rPr>
             <w:rStyle w:val="Hyperlink"/>
@@ -6144,7 +6144,7 @@
         </w:rPr>
         <w:t xml:space="preserve">, </w:t>
       </w:r>
-      <w:hyperlink r:id="rId90">
+      <w:hyperlink r:id="rId90" w:history="1">
         <w:r>
           <w:rPr>
             <w:rStyle w:val="Hyperlink"/>
@@ -6171,7 +6171,7 @@
         </w:rPr>
         <w:t xml:space="preserve">Farm stamps: </w:t>
       </w:r>
-      <w:hyperlink r:id="rId48">
+      <w:hyperlink r:id="rId48" w:history="1">
         <w:r>
           <w:rPr>
             <w:rStyle w:val="Hyperlink"/>
@@ -6189,7 +6189,7 @@
         </w:rPr>
         <w:t xml:space="preserve">, </w:t>
       </w:r>
-      <w:hyperlink r:id="rId84">
+      <w:hyperlink r:id="rId84" w:history="1">
         <w:r>
           <w:rPr>
             <w:rStyle w:val="Hyperlink"/>
@@ -6207,7 +6207,7 @@
         </w:rPr>
         <w:t xml:space="preserve">, Route 89 farm stands — </w:t>
       </w:r>
-      <w:hyperlink r:id="rId107">
+      <w:hyperlink r:id="rId107" w:history="1">
         <w:r>
           <w:rPr>
             <w:rStyle w:val="Hyperlink"/>
@@ -6249,7 +6249,7 @@
         </w:rPr>
         <w:t xml:space="preserve">Cayuga is the longest lake and the most historically layered. When you're ready to go deeper into the region, the </w:t>
       </w:r>
-      <w:hyperlink r:id="rId108">
+      <w:hyperlink r:id="rId108" w:history="1">
         <w:r>
           <w:rPr>
             <w:rStyle w:val="Hyperlink"/>
@@ -6267,7 +6267,7 @@
         </w:rPr>
         <w:t xml:space="preserve"> picks up the wine story thirty-eight miles west, and the </w:t>
       </w:r>
-      <w:hyperlink r:id="rId109">
+      <w:hyperlink r:id="rId109" w:history="1">
         <w:r>
           <w:rPr>
             <w:rStyle w:val="Hyperlink"/>
@@ -6290,7 +6290,7 @@
       <w:pPr>
         <w:shd w:val="clear" w:color="auto" w:fill="EAF4FB"/>
       </w:pPr>
-      <w:hyperlink r:id="rId110">
+      <w:hyperlink r:id="rId110" w:history="1">
         <w:r>
           <w:rPr>
             <w:rStyle w:val="Hyperlink"/>
@@ -6313,7 +6313,7 @@
         </w:rPr>
         <w:t xml:space="preserve">Related: </w:t>
       </w:r>
-      <w:hyperlink r:id="rId111">
+      <w:hyperlink r:id="rId111" w:history="1">
         <w:r>
           <w:rPr>
             <w:rStyle w:val="Hyperlink"/>
@@ -6331,7 +6331,7 @@
         </w:rPr>
         <w:t xml:space="preserve"> · </w:t>
       </w:r>
-      <w:hyperlink r:id="rId85">
+      <w:hyperlink r:id="rId85" w:history="1">
         <w:r>
           <w:rPr>
             <w:rStyle w:val="Hyperlink"/>

</xml_diff>

<commit_message>
Add BEST FOR subtitles to all Cayuga Lake towns
Added town subtitles per canonical template:
- Auburn: BEST FOR THE REFORM CORRIDOR AND HARRIET TUBMAN
- Aurora: BEST FOR THE EAST-SHORE OVERNIGHT AND THE VILLAGE WALK
- Ithaca: BEST FOR GORGES, FOOD, AND THE SOUTHERN BASE
- Seneca Falls: BEST FOR THE WOMEN'S RIGHTS STORY AND THE DECLARATION OF SENTIMENTS
- Trumansburg: BEST FOR THE WEST-SHORE DAY AND TAUGHANNOCK FALLS
- Union Springs: BEST FOR SMALL-PRODUCTION RIESLING AND LAKEFRONT DINING

https://claude.ai/code/session_01U3WqWP1TXbCcMwgjBVLhkU
</commit_message>
<xml_diff>
--- a/Cayuga_Lake_Chapter_v2.docx
+++ b/Cayuga_Lake_Chapter_v2.docx
@@ -1139,6 +1139,16 @@
       </w:r>
     </w:p>
     <w:p>
+      <w:r>
+        <w:rPr>
+          <w:rFonts w:ascii="Arial" w:hAnsi="Arial"/>
+          <w:b/>
+          <w:sz w:val="20"/>
+        </w:rPr>
+        <w:t>BEST FOR THE REFORM CORRIDOR AND HARRIET TUBMAN</w:t>
+      </w:r>
+    </w:p>
+    <w:p>
       <w:hyperlink r:id="rId10" w:history="1">
         <w:r>
           <w:rPr>
@@ -1335,6 +1345,16 @@
       <w:r>
         <w:rPr>
           <w:rFonts w:ascii="Arial" w:hAnsi="Arial"/>
+          <w:b/>
+          <w:sz w:val="20"/>
+        </w:rPr>
+        <w:t>BEST FOR THE EAST-SHORE OVERNIGHT AND THE VILLAGE WALK</w:t>
+      </w:r>
+    </w:p>
+    <w:p>
+      <w:r>
+        <w:rPr>
+          <w:rFonts w:ascii="Arial" w:hAnsi="Arial"/>
         </w:rPr>
         <w:t xml:space="preserve">See the anchor identity section above — the full biography is there. What's worth adding for the town portrait: </w:t>
       </w:r>
@@ -1487,6 +1507,16 @@
           <w:sz w:val="20"/>
         </w:rPr>
         <w:t>TOMPKINS COUNTY · SOUTH END OF THE LAKE · POP. ~35,000 + 20,000 STUDENTS</w:t>
+      </w:r>
+    </w:p>
+    <w:p>
+      <w:r>
+        <w:rPr>
+          <w:rFonts w:ascii="Arial" w:hAnsi="Arial"/>
+          <w:b/>
+          <w:sz w:val="20"/>
+        </w:rPr>
+        <w:t>BEST FOR GORGES, FOOD, AND THE SOUTHERN BASE</w:t>
       </w:r>
     </w:p>
     <w:p>
@@ -1736,6 +1766,16 @@
       <w:r>
         <w:rPr>
           <w:rFonts w:ascii="Arial" w:hAnsi="Arial"/>
+          <w:b/>
+          <w:sz w:val="20"/>
+        </w:rPr>
+        <w:t>BEST FOR THE WOMEN'S RIGHTS STORY AND THE DECLARATION OF SENTIMENTS</w:t>
+      </w:r>
+    </w:p>
+    <w:p>
+      <w:r>
+        <w:rPr>
+          <w:rFonts w:ascii="Arial" w:hAnsi="Arial"/>
         </w:rPr>
         <w:t xml:space="preserve">On July 19-20, 1848, 300 people gathered in the </w:t>
       </w:r>
@@ -1957,6 +1997,16 @@
       <w:r>
         <w:rPr>
           <w:rFonts w:ascii="Arial" w:hAnsi="Arial"/>
+          <w:b/>
+          <w:sz w:val="20"/>
+        </w:rPr>
+        <w:t>BEST FOR THE WEST-SHORE DAY AND TAUGHANNOCK FALLS</w:t>
+      </w:r>
+    </w:p>
+    <w:p>
+      <w:r>
+        <w:rPr>
+          <w:rFonts w:ascii="Arial" w:hAnsi="Arial"/>
         </w:rPr>
         <w:t xml:space="preserve">Two miles south of </w:t>
       </w:r>
@@ -2034,6 +2084,16 @@
           <w:sz w:val="20"/>
         </w:rPr>
         <w:t>CAYUGA COUNTY · EAST SHORE, UPPER MID-LAKE · POP. ~1,100</w:t>
+      </w:r>
+    </w:p>
+    <w:p>
+      <w:r>
+        <w:rPr>
+          <w:rFonts w:ascii="Arial" w:hAnsi="Arial"/>
+          <w:b/>
+          <w:sz w:val="20"/>
+        </w:rPr>
+        <w:t>BEST FOR SMALL-PRODUCTION RIESLING AND LAKEFRONT DINING</w:t>
       </w:r>
     </w:p>
     <w:p>

</xml_diff>

<commit_message>
Add subtitles, short descriptions, and full descriptions to all entries
Both chapters now have subtitle/tagline + short description + full description
for every named entry across all sections:

Cayuga:
- 10 heritage sites with subtitles and expanded descriptions
- 8 wine producers with subtitles and full descriptions
- 4 farm entries (Cider House, Lively Run, Farmers Market, Route 89 stands)
- 5 outdoor sites with subtitles (Taughannock, Buttermilk/Treman, Cascadilla, Montezuma)

Seneca:
- 5 heritage sites with subtitles and expanded descriptions
- 8 "producers worth naming" with subtitles and full descriptions
- 4 farm/craft beverage entries (Hazlitt/Cider Tree, Two Goats, FL Distilling, Blueberry Patch)
- 5 nature sites with subtitles and expanded descriptions

Subtitle styles varied: "BEST FOR", "KNOWN FOR", and punchy taglines.

https://claude.ai/code/session_01U3WqWP1TXbCcMwgjBVLhkU
</commit_message>
<xml_diff>
--- a/Cayuga_Lake_Chapter_v2.docx
+++ b/Cayuga_Lake_Chapter_v2.docx
@@ -3178,11 +3178,19 @@
           <w:t xml:space="preserve">Auburn / Fleming</w:t>
         </w:r>
       </w:hyperlink>
-      <w:r>
-        <w:rPr>
-          <w:rFonts w:ascii="Arial" w:hAnsi="Arial"/>
-        </w:rPr>
-        <w:t xml:space="preserve"> The home, the Home for the Aged, the Thompson AME Zion Church. NPS visitor center at the church.</w:t>
+    </w:p>
+    <w:p>
+      <w:r>
+        <w:rPr>
+          <w:rFonts w:ascii="Arial" w:hAnsi="Arial"/>
+          <w:i/>
+        </w:rPr>
+        <w:t>Where freedom found an address</w:t>
+      </w:r>
+    </w:p>
+    <w:p>
+      <w:r>
+        <w:t>The home, the Home for the Aged, the Thompson AME Zion Church. NPS visitor center at the church. Tubman lived at 180 South Street from 1859 until her death in 1913, making it the longest-occupied site in the Underground Railroad network. The Home for the Aged, which she built in 1908 and deeded to the Thompson AME Zion Church, served elderly African Americans with nowhere else to go. The NPS visitor center at the church is the best starting point; rangers lead guided walks to the residence and the Home for the Aged. Open year-round. Free admission.</w:t>
       </w:r>
     </w:p>
     <w:p>
@@ -3217,11 +3225,19 @@
           <w:t xml:space="preserve">Auburn</w:t>
         </w:r>
       </w:hyperlink>
-      <w:r>
-        <w:rPr>
-          <w:rFonts w:ascii="Arial" w:hAnsi="Arial"/>
-        </w:rPr>
-        <w:t xml:space="preserve"> Tubman's burial site. Designated as park 1836. Path Through History site.</w:t>
+    </w:p>
+    <w:p>
+      <w:r>
+        <w:rPr>
+          <w:rFonts w:ascii="Arial" w:hAnsi="Arial"/>
+          <w:i/>
+        </w:rPr>
+        <w:t>The marker is famously spare: just her name</w:t>
+      </w:r>
+    </w:p>
+    <w:p>
+      <w:r>
+        <w:t>Tubman's burial site, three blocks from her home. Designated as a public park in 1836, the cemetery also holds the graves of William H. Seward and other figures from Auburn's reform era. The Tubman gravesite is marked with a simple headstone. Path Through History site.</w:t>
       </w:r>
     </w:p>
     <w:p>
@@ -3261,11 +3277,19 @@
           <w:t xml:space="preserve">Auburn</w:t>
         </w:r>
       </w:hyperlink>
-      <w:r>
-        <w:rPr>
-          <w:rFonts w:ascii="Arial" w:hAnsi="Arial"/>
-        </w:rPr>
-        <w:t xml:space="preserve"> Underground Railroad site. Original Seward furnishings and documents. Path Through History.</w:t>
+    </w:p>
+    <w:p>
+      <w:r>
+        <w:rPr>
+          <w:rFonts w:ascii="Arial" w:hAnsi="Arial"/>
+          <w:i/>
+        </w:rPr>
+        <w:t>The senator who sold Tubman a farm and bought Alaska</w:t>
+      </w:r>
+    </w:p>
+    <w:p>
+      <w:r>
+        <w:t>Underground Railroad documented stop and the private residence of William Henry Seward, who served as Governor, Senator, and Secretary of State. Original furnishings, documents, and the room where Seward arranged the land sale to Tubman. Frederick Douglass was a frequent guest. Operated as a museum since 1955. Path Through History site.</w:t>
       </w:r>
     </w:p>
     <w:p>
@@ -3300,11 +3324,19 @@
           <w:t xml:space="preserve">Auburn</w:t>
         </w:r>
       </w:hyperlink>
-      <w:r>
-        <w:rPr>
-          <w:rFonts w:ascii="Arial" w:hAnsi="Arial"/>
-        </w:rPr>
-        <w:t xml:space="preserve"> Exhibits on Tubman, Stanton, the reform network.</w:t>
+    </w:p>
+    <w:p>
+      <w:r>
+        <w:rPr>
+          <w:rFonts w:ascii="Arial" w:hAnsi="Arial"/>
+          <w:i/>
+        </w:rPr>
+        <w:t>The reform network, mapped and explained</w:t>
+      </w:r>
+    </w:p>
+    <w:p>
+      <w:r>
+        <w:t>Interactive exhibits on Tubman, Stanton, Douglass, and the overlapping reform movements that ran through this corridor. The center connects the heritage sites into a single narrative and serves as a practical starting point for the Auburn walking itinerary. Free admission.</w:t>
       </w:r>
     </w:p>
     <w:p>
@@ -3339,11 +3371,19 @@
           <w:t xml:space="preserve">Auburn</w:t>
         </w:r>
       </w:hyperlink>
-      <w:r>
-        <w:rPr>
-          <w:rFonts w:ascii="Arial" w:hAnsi="Arial"/>
-        </w:rPr>
-        <w:t xml:space="preserve"> Only complete unaltered Tiffany interior in the United States. 1894. Path Through History.</w:t>
+    </w:p>
+    <w:p>
+      <w:r>
+        <w:rPr>
+          <w:rFonts w:ascii="Arial" w:hAnsi="Arial"/>
+          <w:i/>
+        </w:rPr>
+        <w:t>The last complete Tiffany interior on earth</w:t>
+      </w:r>
+    </w:p>
+    <w:p>
+      <w:r>
+        <w:t>The only complete, unaltered Louis Comfort Tiffany interior remaining in the United States. Tiffany designed the entire space in 1894: the stained glass, the mosaic floor tiles, the metalwork, the oak furnishings. It survived because the adjoining seminary closed and transferred ownership carefully rather than demolishing. Most people driving through Auburn don't know it exists. Path Through History site.</w:t>
       </w:r>
     </w:p>
     <w:p>
@@ -3383,11 +3423,19 @@
           <w:t xml:space="preserve">Seneca Falls</w:t>
         </w:r>
       </w:hyperlink>
-      <w:r>
-        <w:rPr>
-          <w:rFonts w:ascii="Arial" w:hAnsi="Arial"/>
-        </w:rPr>
-        <w:t xml:space="preserve"> Wesleyan Chapel, M'Clintock House (Waterloo), Stanton House. Declaration of Sentiments site.</w:t>
+    </w:p>
+    <w:p>
+      <w:r>
+        <w:rPr>
+          <w:rFonts w:ascii="Arial" w:hAnsi="Arial"/>
+          <w:i/>
+        </w:rPr>
+        <w:t>Where 300 people rewrote the rules in two days</w:t>
+      </w:r>
+    </w:p>
+    <w:p>
+      <w:r>
+        <w:t>The Wesleyan Chapel where 300 people gathered on July 19-20, 1848 for the first formal women's rights convention in American history. Elizabeth Cady Stanton read the Declaration of Sentiments; Frederick Douglass made the argument that clinched the suffrage vote. Also encompasses the M'Clintock House in Waterloo where the Declaration was drafted and Stanton's home. NPS visitor center on Fall Street.</w:t>
       </w:r>
     </w:p>
     <w:p>
@@ -3422,11 +3470,19 @@
           <w:t xml:space="preserve">Aurora</w:t>
         </w:r>
       </w:hyperlink>
-      <w:r>
-        <w:rPr>
-          <w:rFonts w:ascii="Arial" w:hAnsi="Arial"/>
-        </w:rPr>
-        <w:t xml:space="preserve"> 1837 cobblestone building. Quaker abolitionist family. Underground Railroad connected.</w:t>
+    </w:p>
+    <w:p>
+      <w:r>
+        <w:rPr>
+          <w:rFonts w:ascii="Arial" w:hAnsi="Arial"/>
+          <w:i/>
+        </w:rPr>
+        <w:t>Quaker abolitionists, cobblestone walls, 1837</w:t>
+      </w:r>
+    </w:p>
+    <w:p>
+      <w:r>
+        <w:t>1837 cobblestone commercial building on Aurora's main street. The Howland family were prominent Quaker abolitionists connected to the Underground Railroad network. The museum preserves the building and tells the story of the reform-era families who made Aurora a node in the abolitionist movement decades before Tubman arrived.</w:t>
       </w:r>
     </w:p>
     <w:p>
@@ -3461,11 +3517,19 @@
           <w:t xml:space="preserve">Montezuma</w:t>
         </w:r>
       </w:hyperlink>
-      <w:r>
-        <w:rPr>
-          <w:rFonts w:ascii="Arial" w:hAnsi="Arial"/>
-        </w:rPr>
-        <w:t xml:space="preserve"> Along Seneca River and Erie Canal. Underground Railroad crossing at the lake's north end.</w:t>
+    </w:p>
+    <w:p>
+      <w:r>
+        <w:rPr>
+          <w:rFonts w:ascii="Arial" w:hAnsi="Arial"/>
+          <w:i/>
+        </w:rPr>
+        <w:t>The crossing point at the lake's north end</w:t>
+      </w:r>
+    </w:p>
+    <w:p>
+      <w:r>
+        <w:t>Along the Seneca River and Erie Canal at Cayuga Lake's northern outlet. The park marks a documented Underground Railroad crossing where the canal and river systems provided routes north toward Canada. The landscape connects the heritage corridor to the waterways that made the network function.</w:t>
       </w:r>
     </w:p>
     <w:p>
@@ -3505,11 +3569,19 @@
           <w:t xml:space="preserve">Ithaca</w:t>
         </w:r>
       </w:hyperlink>
-      <w:r>
-        <w:rPr>
-          <w:rFonts w:ascii="Arial" w:hAnsi="Arial"/>
-        </w:rPr>
-        <w:t xml:space="preserve"> Paleontological museum at Cornell. The glacial formation story told in stone.</w:t>
+    </w:p>
+    <w:p>
+      <w:r>
+        <w:rPr>
+          <w:rFonts w:ascii="Arial" w:hAnsi="Arial"/>
+          <w:i/>
+        </w:rPr>
+        <w:t>Two million years of glacial history told in stone</w:t>
+      </w:r>
+    </w:p>
+    <w:p>
+      <w:r>
+        <w:t>Paleontological research museum affiliated with Cornell. The permanent collection explains the glacial formation that carved the Finger Lakes, created the gorges, and deposited the shale soils that make the wine region possible. The Right Whale skeleton in the main hall is 40 feet long. A useful first stop for visitors who want to understand why the landscape looks the way it does.</w:t>
       </w:r>
     </w:p>
     <w:p>
@@ -3544,11 +3616,19 @@
           <w:t xml:space="preserve">Auburn</w:t>
         </w:r>
       </w:hyperlink>
-      <w:r>
-        <w:rPr>
-          <w:rFonts w:ascii="Arial" w:hAnsi="Arial"/>
-        </w:rPr>
-        <w:t xml:space="preserve"> Regional agricultural history. Connects farming past to contemporary farm trail.</w:t>
+    </w:p>
+    <w:p>
+      <w:r>
+        <w:rPr>
+          <w:rFonts w:ascii="Arial" w:hAnsi="Arial"/>
+          <w:i/>
+        </w:rPr>
+        <w:t>Known for connecting farming past to the contemporary trail</w:t>
+      </w:r>
+    </w:p>
+    <w:p>
+      <w:r>
+        <w:t>Regional agricultural history spanning two centuries of Finger Lakes farming. The collection connects the practices of the Haudenosaunee and early settlers to the contemporary farm trail. Useful context for the Cayuga Farm Loop.</w:t>
       </w:r>
     </w:p>
     <w:p>
@@ -3693,11 +3773,19 @@
           <w:t xml:space="preserve">Union Springs — east shore</w:t>
         </w:r>
       </w:hyperlink>
-      <w:r>
-        <w:rPr>
-          <w:rFonts w:ascii="Arial" w:hAnsi="Arial"/>
-        </w:rPr>
-        <w:t xml:space="preserve"> Small-production Riesling specialist. The east-shore expression at its most focused.</w:t>
+    </w:p>
+    <w:p>
+      <w:r>
+        <w:rPr>
+          <w:rFonts w:ascii="Arial" w:hAnsi="Arial"/>
+          <w:i/>
+        </w:rPr>
+        <w:t>The east shore at its most focused</w:t>
+      </w:r>
+    </w:p>
+    <w:p>
+      <w:r>
+        <w:t>Small-production Riesling specialist. Tom and Susan Higgins farm a single east-shore vineyard and make wine with a restraint that lets the site speak. The tasting room is intimate and unhurried. If you want to understand what Cayuga east-shore Riesling tastes like at its most precise, this is the stop.</w:t>
       </w:r>
     </w:p>
     <w:p>
@@ -3737,11 +3825,19 @@
           <w:t xml:space="preserve">King Ferry — east shore</w:t>
         </w:r>
       </w:hyperlink>
-      <w:r>
-        <w:rPr>
-          <w:rFonts w:ascii="Arial" w:hAnsi="Arial"/>
-        </w:rPr>
-        <w:t xml:space="preserve"> Thirty-year estate. Award-winning dry Riesling, outdoor terrace overlooking the lake.</w:t>
+    </w:p>
+    <w:p>
+      <w:r>
+        <w:rPr>
+          <w:rFonts w:ascii="Arial" w:hAnsi="Arial"/>
+          <w:i/>
+        </w:rPr>
+        <w:t>Thirty years on the same hillside</w:t>
+      </w:r>
+    </w:p>
+    <w:p>
+      <w:r>
+        <w:t>Thirty-year estate operation on the east shore. Award-winning dry Riesling from vines that have had decades to find their depth. Outdoor terrace overlooking the lake. The kind of producer that doesn't need to explain itself because the wine does the talking.</w:t>
       </w:r>
     </w:p>
     <w:p>
@@ -3781,11 +3877,19 @@
           <w:t xml:space="preserve">Lodi — east Cayuga / Seneca border</w:t>
         </w:r>
       </w:hyperlink>
-      <w:r>
-        <w:rPr>
-          <w:rFonts w:ascii="Arial" w:hAnsi="Arial"/>
-        </w:rPr>
-        <w:t xml:space="preserve"> Single-vineyard Riesling program. The argument for why single-vineyard designations matter in this AVA.</w:t>
+    </w:p>
+    <w:p>
+      <w:r>
+        <w:rPr>
+          <w:rFonts w:ascii="Arial" w:hAnsi="Arial"/>
+          <w:i/>
+        </w:rPr>
+        <w:t>One vineyard, one variety, no compromises</w:t>
+      </w:r>
+    </w:p>
+    <w:p>
+      <w:r>
+        <w:t>Single-vineyard Riesling program on the ridge between Cayuga and Seneca Lakes. Wine Enthusiast named their Dry Riesling to its Top 100 Wines in the World twice. No buses, no groups larger than six. The argument for why single-vineyard designations matter in this AVA.</w:t>
       </w:r>
     </w:p>
     <w:p>
@@ -3825,11 +3929,19 @@
           <w:t xml:space="preserve">Interlaken — west shore</w:t>
         </w:r>
       </w:hyperlink>
-      <w:r>
-        <w:rPr>
-          <w:rFonts w:ascii="Arial" w:hAnsi="Arial"/>
-        </w:rPr>
-        <w:t xml:space="preserve"> One of the older Cayuga producers. Also cider. Family-run.</w:t>
+    </w:p>
+    <w:p>
+      <w:r>
+        <w:rPr>
+          <w:rFonts w:ascii="Arial" w:hAnsi="Arial"/>
+          <w:i/>
+        </w:rPr>
+        <w:t>Known for longevity and a family welcome</w:t>
+      </w:r>
+    </w:p>
+    <w:p>
+      <w:r>
+        <w:t>One of the older Cayuga producers, family-run since the beginning. Wine and cider on the same property, a broad portfolio that serves first-time trail visitors and repeat customers equally well. The west-shore stop with the widest range.</w:t>
       </w:r>
     </w:p>
     <w:p>
@@ -3869,11 +3981,19 @@
           <w:t xml:space="preserve">Romulus — west shore</w:t>
         </w:r>
       </w:hyperlink>
-      <w:r>
-        <w:rPr>
-          <w:rFonts w:ascii="Arial" w:hAnsi="Arial"/>
-        </w:rPr>
-        <w:t xml:space="preserve"> Estate grown, lakeside tasting room.</w:t>
+    </w:p>
+    <w:p>
+      <w:r>
+        <w:rPr>
+          <w:rFonts w:ascii="Arial" w:hAnsi="Arial"/>
+          <w:i/>
+        </w:rPr>
+        <w:t>Estate-grown wine, lakeside pour</w:t>
+      </w:r>
+    </w:p>
+    <w:p>
+      <w:r>
+        <w:t>Estate-grown grapes, lakeside tasting room on the west shore. The vineyard faces the lake directly, and the tasting room takes advantage of it. A straightforward, well-run operation that rewards a stop on the Route 89 loop.</w:t>
       </w:r>
     </w:p>
     <w:p>
@@ -3913,11 +4033,19 @@
           <w:t xml:space="preserve">Trumansburg — west shore</w:t>
         </w:r>
       </w:hyperlink>
-      <w:r>
-        <w:rPr>
-          <w:rFonts w:ascii="Arial" w:hAnsi="Arial"/>
-        </w:rPr>
-        <w:t xml:space="preserve"> Family estate near Taughannock. One of the trail's quieter stops.</w:t>
+    </w:p>
+    <w:p>
+      <w:r>
+        <w:rPr>
+          <w:rFonts w:ascii="Arial" w:hAnsi="Arial"/>
+          <w:i/>
+        </w:rPr>
+        <w:t>The quiet stop near Taughannock</w:t>
+      </w:r>
+    </w:p>
+    <w:p>
+      <w:r>
+        <w:t>Family estate on the west shore near Taughannock Falls State Park. Small production, personal pours, the kind of stop where the winemaker might be the one pouring. One of the trail's quieter experiences, best paired with a Taughannock visit.</w:t>
       </w:r>
     </w:p>
     <w:p>
@@ -3957,11 +4085,19 @@
           <w:t xml:space="preserve">Ithaca</w:t>
         </w:r>
       </w:hyperlink>
-      <w:r>
-        <w:rPr>
-          <w:rFonts w:ascii="Arial" w:hAnsi="Arial"/>
-        </w:rPr>
-        <w:t xml:space="preserve"> Closest winery to downtown Ithaca. The entry point for first-time visitors.</w:t>
+    </w:p>
+    <w:p>
+      <w:r>
+        <w:rPr>
+          <w:rFonts w:ascii="Arial" w:hAnsi="Arial"/>
+          <w:i/>
+        </w:rPr>
+        <w:t>The closest winery to the Commons</w:t>
+      </w:r>
+    </w:p>
+    <w:p>
+      <w:r>
+        <w:t>Closest winery to downtown Ithaca, making it the natural entry point for first-time visitors and the last stop before heading back to town. Broad portfolio, casual tasting room, outdoor seating with valley views.</w:t>
       </w:r>
     </w:p>
     <w:p>
@@ -4001,11 +4137,19 @@
           <w:t xml:space="preserve">Aurora — east shore</w:t>
         </w:r>
       </w:hyperlink>
-      <w:r>
-        <w:rPr>
-          <w:rFonts w:ascii="Arial" w:hAnsi="Arial"/>
-        </w:rPr>
-        <w:t xml:space="preserve"> Worth pairing with a stay at the Inns of Aurora.</w:t>
+    </w:p>
+    <w:p>
+      <w:r>
+        <w:rPr>
+          <w:rFonts w:ascii="Arial" w:hAnsi="Arial"/>
+          <w:i/>
+        </w:rPr>
+        <w:t>Best paired with a night at the Inns</w:t>
+      </w:r>
+    </w:p>
+    <w:p>
+      <w:r>
+        <w:t>East-shore tasting room in Aurora, worth combining with a stay at the Inns of Aurora for the complete east-shore day. The view from the tasting room faces west across the lake. Small-scale, personal service.</w:t>
       </w:r>
     </w:p>
     <w:p>
@@ -4097,7 +4241,7 @@
         <w:rPr>
           <w:rFonts w:ascii="Arial" w:hAnsi="Arial"/>
         </w:rPr>
-        <w:t xml:space="preserve">The </w:t>
+        <w:t xml:space="preserve">— </w:t>
       </w:r>
       <w:hyperlink r:id="rId48" w:history="1">
         <w:r>
@@ -4108,14 +4252,14 @@
             <w:rFonts w:ascii="Arial" w:hAnsi="Arial"/>
             <w:sz w:val="22"/>
           </w:rPr>
-          <w:t xml:space="preserve">Finger Lakes Cider House</w:t>
+          <w:t xml:space="preserve">Finger Lakes Cider House at Good Life Farm</w:t>
         </w:r>
       </w:hyperlink>
       <w:r>
         <w:rPr>
           <w:rFonts w:ascii="Arial" w:hAnsi="Arial"/>
         </w:rPr>
-        <w:t xml:space="preserve"> at </w:t>
+        <w:t xml:space="preserve"> </w:t>
       </w:r>
       <w:hyperlink r:id="rId49" w:history="1">
         <w:r>
@@ -4126,34 +4270,32 @@
             <w:rFonts w:ascii="Arial" w:hAnsi="Arial"/>
             <w:sz w:val="22"/>
           </w:rPr>
-          <w:t xml:space="preserve">Good Life Farm</w:t>
+          <w:t xml:space="preserve">Interlaken / Trumansburg</w:t>
         </w:r>
       </w:hyperlink>
-      <w:r>
-        <w:rPr>
-          <w:rFonts w:ascii="Arial" w:hAnsi="Arial"/>
-        </w:rPr>
-        <w:t xml:space="preserve"> sits on Cayuga's western shore outside </w:t>
+    </w:p>
+    <w:p>
+      <w:r>
+        <w:rPr>
+          <w:rFonts w:ascii="Arial" w:hAnsi="Arial"/>
+          <w:i/>
+        </w:rPr>
+        <w:t>Four cideries under one roof on a working organic farm</w:t>
+      </w:r>
+    </w:p>
+    <w:p>
+      <w:r>
+        <w:t>The anchor of the Cayuga Farm Loop. Four cideries share a single tasting room on a working organic farm on Cayuga's western shore outside Trumansburg. Food is sourced from neighboring properties. The farm itself is open to walk; the cideries rotate their offerings seasonally. Pair with a stop at Lively Run Dairy two miles south for the full farm corridor experience. Badge: Finger Lakes Farm Trail.</w:t>
+      </w:r>
+    </w:p>
+    <w:p>
+      <w:r>
+        <w:rPr>
+          <w:rFonts w:ascii="Arial" w:hAnsi="Arial"/>
+        </w:rPr>
+        <w:t xml:space="preserve">— </w:t>
       </w:r>
       <w:hyperlink r:id="rId83" w:history="1">
-        <w:r>
-          <w:rPr>
-            <w:rStyle w:val="Hyperlink"/>
-            <w:color w:val="1A7340"/>
-            <w:u w:val="single"/>
-            <w:rFonts w:ascii="Arial" w:hAnsi="Arial"/>
-            <w:sz w:val="22"/>
-          </w:rPr>
-          <w:t xml:space="preserve">Trumansburg</w:t>
-        </w:r>
-      </w:hyperlink>
-      <w:r>
-        <w:rPr>
-          <w:rFonts w:ascii="Arial" w:hAnsi="Arial"/>
-        </w:rPr>
-        <w:t xml:space="preserve"> — four cideries under one roof, a working organic farm, food sourced from the neighboring properties. Two miles south, </w:t>
-      </w:r>
-      <w:hyperlink r:id="rId84" w:history="1">
         <w:r>
           <w:rPr>
             <w:rStyle w:val="Hyperlink"/>
@@ -4169,9 +4311,9 @@
         <w:rPr>
           <w:rFonts w:ascii="Arial" w:hAnsi="Arial"/>
         </w:rPr>
-        <w:t xml:space="preserve"> has been making goat cheese in </w:t>
-      </w:r>
-      <w:hyperlink r:id="rId40" w:history="1">
+        <w:t xml:space="preserve"> </w:t>
+      </w:r>
+      <w:hyperlink r:id="rId84" w:history="1">
         <w:r>
           <w:rPr>
             <w:rStyle w:val="Hyperlink"/>
@@ -4183,29 +4325,112 @@
           <w:t xml:space="preserve">Interlaken</w:t>
         </w:r>
       </w:hyperlink>
-      <w:r>
-        <w:rPr>
-          <w:rFonts w:ascii="Arial" w:hAnsi="Arial"/>
-        </w:rPr>
-        <w:t xml:space="preserve"> since 1982. These two stops, with the farm stands along Route 89, constitute what the itinerary calls the </w:t>
+    </w:p>
+    <w:p>
+      <w:r>
+        <w:rPr>
+          <w:rFonts w:ascii="Arial" w:hAnsi="Arial"/>
+          <w:i/>
+        </w:rPr>
+        <w:t>Goat cheese since 1982, before artisan was a category</w:t>
+      </w:r>
+    </w:p>
+    <w:p>
+      <w:r>
+        <w:t>Lively Run has been making goat cheese in Interlaken since 1982, which makes it one of the oldest artisan creameries in the Finger Lakes. The farm store sells the full line; the goats are visible from the parking area. Two miles south of the Finger Lakes Cider House on Route 89. Badge: Finger Lakes Farm Trail.</w:t>
+      </w:r>
+    </w:p>
+    <w:p>
+      <w:r>
+        <w:rPr>
+          <w:rFonts w:ascii="Arial" w:hAnsi="Arial"/>
+        </w:rPr>
+        <w:t xml:space="preserve">— </w:t>
       </w:r>
       <w:hyperlink r:id="rId85" w:history="1">
         <w:r>
           <w:rPr>
             <w:rStyle w:val="Hyperlink"/>
-            <w:color w:val="C0392B"/>
+            <w:color w:val="6C3483"/>
             <w:u w:val="single"/>
             <w:rFonts w:ascii="Arial" w:hAnsi="Arial"/>
             <w:sz w:val="22"/>
           </w:rPr>
-          <w:t xml:space="preserve">Cayuga Farm Loop</w:t>
+          <w:t xml:space="preserve">Ithaca Farmers Market</w:t>
         </w:r>
       </w:hyperlink>
       <w:r>
         <w:rPr>
           <w:rFonts w:ascii="Arial" w:hAnsi="Arial"/>
         </w:rPr>
-        <w:t>. It is a very good day.</w:t>
+        <w:t xml:space="preserve"> </w:t>
+      </w:r>
+      <w:hyperlink r:id="rId86" w:history="1">
+        <w:r>
+          <w:rPr>
+            <w:rStyle w:val="Hyperlink"/>
+            <w:color w:val="1A7340"/>
+            <w:u w:val="single"/>
+            <w:rFonts w:ascii="Arial" w:hAnsi="Arial"/>
+            <w:sz w:val="22"/>
+          </w:rPr>
+          <w:t xml:space="preserve">Steamboat Landing, Ithaca</w:t>
+        </w:r>
+      </w:hyperlink>
+    </w:p>
+    <w:p>
+      <w:r>
+        <w:rPr>
+          <w:rFonts w:ascii="Arial" w:hAnsi="Arial"/>
+          <w:i/>
+        </w:rPr>
+        <w:t>The single best food destination on the lake</w:t>
+      </w:r>
+    </w:p>
+    <w:p>
+      <w:r>
+        <w:t>Saturday and Sunday at Steamboat Landing, producers-only, within sight of Cayuga Lake. Over 130 active vendors, everything grown or made within 30 miles of the pavilion. The market runs April through December on Saturdays, May through November on Sundays. Come early on Saturday; the parking lot fills by 10am.</w:t>
+      </w:r>
+    </w:p>
+    <w:p>
+      <w:r>
+        <w:rPr>
+          <w:rFonts w:ascii="Arial" w:hAnsi="Arial"/>
+        </w:rPr>
+        <w:t>— Route 89 Farm Stands</w:t>
+      </w:r>
+      <w:r>
+        <w:rPr>
+          <w:rFonts w:ascii="Arial" w:hAnsi="Arial"/>
+          <w:b/>
+        </w:rPr>
+        <w:t xml:space="preserve"> </w:t>
+      </w:r>
+      <w:hyperlink r:id="rId87" w:history="1">
+        <w:r>
+          <w:rPr>
+            <w:rStyle w:val="Hyperlink"/>
+            <w:color w:val="1A7340"/>
+            <w:u w:val="single"/>
+            <w:rFonts w:ascii="Arial" w:hAnsi="Arial"/>
+            <w:sz w:val="22"/>
+          </w:rPr>
+          <w:t xml:space="preserve">West shore, Ithaca to Romulus</w:t>
+        </w:r>
+      </w:hyperlink>
+    </w:p>
+    <w:p>
+      <w:r>
+        <w:rPr>
+          <w:rFonts w:ascii="Arial" w:hAnsi="Arial"/>
+          <w:i/>
+        </w:rPr>
+        <w:t>Known for the farm corridor that predates the wine trail</w:t>
+      </w:r>
+    </w:p>
+    <w:p>
+      <w:r>
+        <w:t>The farm stands along Route 89 on Cayuga's west shore have been there longer than the wine trail designation. June through October, the road between Ithaca and Romulus is lined with seasonal produce, cut flowers, and honey. No single stand dominates; the cumulative effect is the point. Badge: Finger Lakes Farm Trail.</w:t>
       </w:r>
     </w:p>
     <w:p>
@@ -4281,10 +4506,14 @@
       <w:r>
         <w:rPr>
           <w:rFonts w:ascii="Arial" w:hAnsi="Arial"/>
-        </w:rPr>
-        <w:t xml:space="preserve">The </w:t>
-      </w:r>
-      <w:hyperlink r:id="rId86" w:history="1">
+          <w:i/>
+          <w:color w:val="666666"/>
+        </w:rPr>
+        <w:t>[ IMAGE: Ithaca Farmers Market — Steamboat Landing, Cayuga Lake visible, vendors and pavilion ]</w:t>
+      </w:r>
+    </w:p>
+    <w:p>
+      <w:hyperlink r:id="rId85" w:history="1">
         <w:r>
           <w:rPr>
             <w:rStyle w:val="Hyperlink"/>
@@ -4299,59 +4528,11 @@
       <w:r>
         <w:rPr>
           <w:rFonts w:ascii="Arial" w:hAnsi="Arial"/>
-        </w:rPr>
-        <w:t xml:space="preserve"> Saturday and Sunday at </w:t>
-      </w:r>
-      <w:hyperlink r:id="rId87" w:history="1">
-        <w:r>
-          <w:rPr>
-            <w:rStyle w:val="Hyperlink"/>
-            <w:color w:val="1A7340"/>
-            <w:u w:val="single"/>
-            <w:rFonts w:ascii="Arial" w:hAnsi="Arial"/>
-            <w:sz w:val="22"/>
-          </w:rPr>
-          <w:t xml:space="preserve">Steamboat Landing</w:t>
-        </w:r>
-      </w:hyperlink>
-      <w:r>
-        <w:rPr>
-          <w:rFonts w:ascii="Arial" w:hAnsi="Arial"/>
-        </w:rPr>
-        <w:t>, producers-only, within sight of Cayuga Lake. Over 130 active vendors, everything grown or made within 30 miles of the pavilion. The market runs April through December on Saturdays, May through November on Sundays. It is the single best food destination on the lake.</w:t>
-      </w:r>
-    </w:p>
-    <w:p>
-      <w:r>
-        <w:rPr>
-          <w:rFonts w:ascii="Arial" w:hAnsi="Arial"/>
           <w:i/>
-          <w:color w:val="666666"/>
-        </w:rPr>
-        <w:t>[ IMAGE: Ithaca Farmers Market — Steamboat Landing, Cayuga Lake visible, vendors and pavilion ]</w:t>
-      </w:r>
-    </w:p>
-    <w:p>
+        </w:rPr>
+        <w:t xml:space="preserve">, </w:t>
+      </w:r>
       <w:hyperlink r:id="rId86" w:history="1">
-        <w:r>
-          <w:rPr>
-            <w:rStyle w:val="Hyperlink"/>
-            <w:color w:val="6C3483"/>
-            <w:u w:val="single"/>
-            <w:rFonts w:ascii="Arial" w:hAnsi="Arial"/>
-            <w:sz w:val="22"/>
-          </w:rPr>
-          <w:t xml:space="preserve">Ithaca Farmers Market</w:t>
-        </w:r>
-      </w:hyperlink>
-      <w:r>
-        <w:rPr>
-          <w:rFonts w:ascii="Arial" w:hAnsi="Arial"/>
-          <w:i/>
-        </w:rPr>
-        <w:t xml:space="preserve">, </w:t>
-      </w:r>
-      <w:hyperlink r:id="rId87" w:history="1">
         <w:r>
           <w:rPr>
             <w:rStyle w:val="Hyperlink"/>
@@ -4809,7 +4990,7 @@
         </w:rPr>
         <w:t xml:space="preserve">, </w:t>
       </w:r>
-      <w:hyperlink r:id="rId83" w:history="1">
+      <w:hyperlink r:id="rId88" w:history="1">
         <w:r>
           <w:rPr>
             <w:rStyle w:val="Hyperlink"/>
@@ -4844,10 +5025,19 @@
       <w:r>
         <w:rPr>
           <w:rFonts w:ascii="Arial" w:hAnsi="Arial"/>
+          <w:i/>
+        </w:rPr>
+        <w:t>Three stories taller than Niagara, and you can walk right up to it</w:t>
+      </w:r>
+    </w:p>
+    <w:p>
+      <w:r>
+        <w:rPr>
+          <w:rFonts w:ascii="Arial" w:hAnsi="Arial"/>
         </w:rPr>
         <w:t xml:space="preserve">Two miles north of </w:t>
       </w:r>
-      <w:hyperlink r:id="rId83" w:history="1">
+      <w:hyperlink r:id="rId88" w:history="1">
         <w:r>
           <w:rPr>
             <w:rStyle w:val="Hyperlink"/>
@@ -4863,7 +5053,7 @@
         <w:rPr>
           <w:rFonts w:ascii="Arial" w:hAnsi="Arial"/>
         </w:rPr>
-        <w:t xml:space="preserve"> on Route 89. Flat gorge trail to the base of the falls. Swimming area and marina on the lake, summer concert series. The Black Diamond Trail runs from Taughannock south to the Cayuga Waterfront Trail in </w:t>
+        <w:t xml:space="preserve"> on Route 89. The 215-foot drop is the tallest single-drop waterfall east of the Rockies. Flat gorge trail to the base of the falls, under a mile. Swimming area and marina on the lake, summer concert series. The Black Diamond Trail runs from Taughannock south to the Cayuga Waterfront Trail in </w:t>
       </w:r>
       <w:hyperlink r:id="rId9" w:history="1">
         <w:r>
@@ -4881,7 +5071,7 @@
         <w:rPr>
           <w:rFonts w:ascii="Arial" w:hAnsi="Arial"/>
         </w:rPr>
-        <w:t xml:space="preserve"> — roughly 12 miles, flat, good for cycling.</w:t>
+        <w:t xml:space="preserve"> — roughly 12 miles, flat, good for cycling. Go in April when the snowmelt is running and the sound reaches the trailhead.</w:t>
       </w:r>
     </w:p>
     <w:p>
@@ -4893,6 +5083,15 @@
           <w:rFonts w:ascii="Arial" w:hAnsi="Arial"/>
         </w:rPr>
         <w:t>Buttermilk Falls and Robert H. Treman State Parks</w:t>
+      </w:r>
+    </w:p>
+    <w:p>
+      <w:r>
+        <w:rPr>
+          <w:rFonts w:ascii="Arial" w:hAnsi="Arial"/>
+          <w:i/>
+        </w:rPr>
+        <w:t>The half-day gorge loop south of town</w:t>
       </w:r>
     </w:p>
     <w:p>
@@ -4920,7 +5119,7 @@
         </w:rPr>
         <w:t xml:space="preserve">. </w:t>
       </w:r>
-      <w:hyperlink r:id="rId88" w:history="1">
+      <w:hyperlink r:id="rId89" w:history="1">
         <w:r>
           <w:rPr>
             <w:rStyle w:val="Hyperlink"/>
@@ -4936,9 +5135,9 @@
         <w:rPr>
           <w:rFonts w:ascii="Arial" w:hAnsi="Arial"/>
         </w:rPr>
-        <w:t xml:space="preserve"> has a natural swimming pool at the base — cold, clear. </w:t>
-      </w:r>
-      <w:hyperlink r:id="rId89" w:history="1">
+        <w:t xml:space="preserve"> has a natural swimming pool at the base — cold, clear, the kind of swim people remember for years. </w:t>
+      </w:r>
+      <w:hyperlink r:id="rId90" w:history="1">
         <w:r>
           <w:rPr>
             <w:rStyle w:val="Hyperlink"/>
@@ -4954,7 +5153,7 @@
         <w:rPr>
           <w:rFonts w:ascii="Arial" w:hAnsi="Arial"/>
         </w:rPr>
-        <w:t xml:space="preserve">'s Enfield Glen contains 12 waterfalls including the 115-foot Lucifer Falls. Together they form the core of a half-day loop from </w:t>
+        <w:t xml:space="preserve">'s Enfield Glen contains 12 waterfalls including the 115-foot Lucifer Falls, which is worth the hike by itself. Together they form the core of a half-day loop from </w:t>
       </w:r>
       <w:hyperlink r:id="rId9" w:history="1">
         <w:r>
@@ -4990,6 +5189,15 @@
       <w:r>
         <w:rPr>
           <w:rFonts w:ascii="Arial" w:hAnsi="Arial"/>
+          <w:i/>
+        </w:rPr>
+        <w:t>For some Cornell students, this is just the commute</w:t>
+      </w:r>
+    </w:p>
+    <w:p>
+      <w:r>
+        <w:rPr>
+          <w:rFonts w:ascii="Arial" w:hAnsi="Arial"/>
         </w:rPr>
         <w:t xml:space="preserve">Runs from downtown </w:t>
       </w:r>
@@ -5027,25 +5235,7 @@
         <w:rPr>
           <w:rFonts w:ascii="Arial" w:hAnsi="Arial"/>
         </w:rPr>
-        <w:t xml:space="preserve"> campus — 400 feet of elevation through layered Devonian shale, six waterfalls, stone staircases from the 1920s. For some </w:t>
-      </w:r>
-      <w:hyperlink r:id="rId35" w:history="1">
-        <w:r>
-          <w:rPr>
-            <w:rStyle w:val="Hyperlink"/>
-            <w:color w:val="0563C1"/>
-            <w:u w:val="single"/>
-            <w:rFonts w:ascii="Arial" w:hAnsi="Arial"/>
-            <w:sz w:val="22"/>
-          </w:rPr>
-          <w:t xml:space="preserve">Cornell</w:t>
-        </w:r>
-      </w:hyperlink>
-      <w:r>
-        <w:rPr>
-          <w:rFonts w:ascii="Arial" w:hAnsi="Arial"/>
-        </w:rPr>
-        <w:t xml:space="preserve"> students, it's just the walk to class.</w:t>
+        <w:t xml:space="preserve"> campus — 400 feet of elevation through layered Devonian shale, six waterfalls, stone staircases built in the 1920s. The gorge trail is a geological classroom in motion: each layer of exposed rock tells a different chapter of the 380-million-year Devonian story.</w:t>
       </w:r>
     </w:p>
     <w:p>
@@ -5063,14 +5253,23 @@
       <w:r>
         <w:rPr>
           <w:rFonts w:ascii="Arial" w:hAnsi="Arial"/>
-        </w:rPr>
-        <w:t>At the lake's north end. Over 300 bird species documented. The Cayuga people called the lake Tiohero — lake of flags or rushes — because of these northern marshes. Over a million ducks counted here in a single autumn. Fall and spring migration seasons are best.</w:t>
+          <w:i/>
+        </w:rPr>
+        <w:t>A million ducks in a single autumn</w:t>
       </w:r>
     </w:p>
     <w:p>
       <w:r>
         <w:rPr>
           <w:rFonts w:ascii="Arial" w:hAnsi="Arial"/>
+        </w:rPr>
+        <w:t>At the lake's north end. Over 300 bird species documented. The Cayuga people called the lake Tiohero — lake of flags or rushes — because of these northern marshes. Over a million ducks counted here in a single autumn. The auto tour loop is 4.5 miles through marsh and upland habitat. Fall and spring migration seasons are best; serious birders should come at dawn.</w:t>
+      </w:r>
+    </w:p>
+    <w:p>
+      <w:r>
+        <w:rPr>
+          <w:rFonts w:ascii="Arial" w:hAnsi="Arial"/>
           <w:i/>
           <w:color w:val="666666"/>
         </w:rPr>
@@ -5078,7 +5277,7 @@
       </w:r>
     </w:p>
     <w:p>
-      <w:hyperlink r:id="rId90" w:history="1">
+      <w:hyperlink r:id="rId91" w:history="1">
         <w:r>
           <w:rPr>
             <w:rStyle w:val="Hyperlink"/>
@@ -5106,7 +5305,7 @@
         </w:rPr>
         <w:t xml:space="preserve">Named sites: </w:t>
       </w:r>
-      <w:hyperlink r:id="rId91" w:history="1">
+      <w:hyperlink r:id="rId92" w:history="1">
         <w:r>
           <w:rPr>
             <w:rStyle w:val="Hyperlink"/>
@@ -5124,7 +5323,7 @@
         </w:rPr>
         <w:t xml:space="preserve"> · </w:t>
       </w:r>
-      <w:hyperlink r:id="rId88" w:history="1">
+      <w:hyperlink r:id="rId89" w:history="1">
         <w:r>
           <w:rPr>
             <w:rStyle w:val="Hyperlink"/>
@@ -5142,7 +5341,7 @@
         </w:rPr>
         <w:t xml:space="preserve"> · </w:t>
       </w:r>
-      <w:hyperlink r:id="rId89" w:history="1">
+      <w:hyperlink r:id="rId90" w:history="1">
         <w:r>
           <w:rPr>
             <w:rStyle w:val="Hyperlink"/>
@@ -5196,7 +5395,7 @@
         </w:rPr>
         <w:t xml:space="preserve"> · </w:t>
       </w:r>
-      <w:hyperlink r:id="rId90" w:history="1">
+      <w:hyperlink r:id="rId91" w:history="1">
         <w:r>
           <w:rPr>
             <w:rStyle w:val="Hyperlink"/>
@@ -5239,7 +5438,7 @@
         </w:rPr>
         <w:t xml:space="preserve"> · </w:t>
       </w:r>
-      <w:hyperlink r:id="rId92" w:history="1">
+      <w:hyperlink r:id="rId93" w:history="1">
         <w:r>
           <w:rPr>
             <w:rStyle w:val="Hyperlink"/>
@@ -5258,7 +5457,7 @@
       </w:r>
     </w:p>
     <w:p>
-      <w:hyperlink r:id="rId93" w:history="1">
+      <w:hyperlink r:id="rId94" w:history="1">
         <w:r>
           <w:rPr>
             <w:rStyle w:val="Hyperlink"/>
@@ -5276,7 +5475,7 @@
         </w:rPr>
         <w:t xml:space="preserve"> · </w:t>
       </w:r>
-      <w:hyperlink r:id="rId94" w:history="1">
+      <w:hyperlink r:id="rId95" w:history="1">
         <w:r>
           <w:rPr>
             <w:rStyle w:val="Hyperlink"/>
@@ -5295,7 +5494,7 @@
       </w:r>
     </w:p>
     <w:p>
-      <w:hyperlink r:id="rId95" w:history="1">
+      <w:hyperlink r:id="rId96" w:history="1">
         <w:r>
           <w:rPr>
             <w:rStyle w:val="Hyperlink"/>
@@ -5313,7 +5512,7 @@
         </w:rPr>
         <w:t xml:space="preserve"> · </w:t>
       </w:r>
-      <w:hyperlink r:id="rId96" w:history="1">
+      <w:hyperlink r:id="rId97" w:history="1">
         <w:r>
           <w:rPr>
             <w:rStyle w:val="Hyperlink"/>
@@ -5332,7 +5531,7 @@
       </w:r>
     </w:p>
     <w:p>
-      <w:hyperlink r:id="rId97" w:history="1">
+      <w:hyperlink r:id="rId98" w:history="1">
         <w:r>
           <w:rPr>
             <w:rStyle w:val="Hyperlink"/>
@@ -5350,7 +5549,7 @@
         </w:rPr>
         <w:t xml:space="preserve"> · </w:t>
       </w:r>
-      <w:hyperlink r:id="rId98" w:history="1">
+      <w:hyperlink r:id="rId99" w:history="1">
         <w:r>
           <w:rPr>
             <w:rStyle w:val="Hyperlink"/>
@@ -5369,7 +5568,7 @@
       </w:r>
     </w:p>
     <w:p>
-      <w:hyperlink r:id="rId99" w:history="1">
+      <w:hyperlink r:id="rId100" w:history="1">
         <w:r>
           <w:rPr>
             <w:rStyle w:val="Hyperlink"/>
@@ -5387,7 +5586,7 @@
         </w:rPr>
         <w:t xml:space="preserve"> · </w:t>
       </w:r>
-      <w:hyperlink r:id="rId100" w:history="1">
+      <w:hyperlink r:id="rId101" w:history="1">
         <w:r>
           <w:rPr>
             <w:rStyle w:val="Hyperlink"/>
@@ -5406,7 +5605,7 @@
       </w:r>
     </w:p>
     <w:p>
-      <w:hyperlink r:id="rId101" w:history="1">
+      <w:hyperlink r:id="rId102" w:history="1">
         <w:r>
           <w:rPr>
             <w:rStyle w:val="Hyperlink"/>
@@ -5424,7 +5623,7 @@
         </w:rPr>
         <w:t xml:space="preserve"> · </w:t>
       </w:r>
-      <w:hyperlink r:id="rId102" w:history="1">
+      <w:hyperlink r:id="rId103" w:history="1">
         <w:r>
           <w:rPr>
             <w:rStyle w:val="Hyperlink"/>
@@ -5460,7 +5659,7 @@
         </w:rPr>
         <w:t xml:space="preserve">Cayuga Lake requires a car. </w:t>
       </w:r>
-      <w:hyperlink r:id="rId103" w:history="1">
+      <w:hyperlink r:id="rId104" w:history="1">
         <w:r>
           <w:rPr>
             <w:rStyle w:val="Hyperlink"/>
@@ -5478,7 +5677,7 @@
         </w:rPr>
         <w:t xml:space="preserve"> has limited routes. </w:t>
       </w:r>
-      <w:hyperlink r:id="rId104" w:history="1">
+      <w:hyperlink r:id="rId105" w:history="1">
         <w:r>
           <w:rPr>
             <w:rStyle w:val="Hyperlink"/>
@@ -5823,7 +6022,7 @@
         </w:rPr>
         <w:t xml:space="preserve"> north through </w:t>
       </w:r>
-      <w:hyperlink r:id="rId83" w:history="1">
+      <w:hyperlink r:id="rId88" w:history="1">
         <w:r>
           <w:rPr>
             <w:rStyle w:val="Hyperlink"/>
@@ -5859,7 +6058,7 @@
         </w:rPr>
         <w:t xml:space="preserve">, and </w:t>
       </w:r>
-      <w:hyperlink r:id="rId105" w:history="1">
+      <w:hyperlink r:id="rId106" w:history="1">
         <w:r>
           <w:rPr>
             <w:rStyle w:val="Hyperlink"/>
@@ -5895,7 +6094,7 @@
         </w:rPr>
         <w:t xml:space="preserve">, </w:t>
       </w:r>
-      <w:hyperlink r:id="rId106" w:history="1">
+      <w:hyperlink r:id="rId107" w:history="1">
         <w:r>
           <w:rPr>
             <w:rStyle w:val="Hyperlink"/>
@@ -5950,7 +6149,7 @@
         </w:rPr>
         <w:t xml:space="preserve">Wine trail tasting rooms: full hours May through November, reduced or closed December through April — call ahead. Farmers Market: Saturday April through December, Sunday May through November. Gorge trails best May through October; </w:t>
       </w:r>
-      <w:hyperlink r:id="rId90" w:history="1">
+      <w:hyperlink r:id="rId91" w:history="1">
         <w:r>
           <w:rPr>
             <w:rStyle w:val="Hyperlink"/>
@@ -6150,7 +6349,7 @@
         </w:rPr>
         <w:t xml:space="preserve">Nature stamps: </w:t>
       </w:r>
-      <w:hyperlink r:id="rId91" w:history="1">
+      <w:hyperlink r:id="rId92" w:history="1">
         <w:r>
           <w:rPr>
             <w:rStyle w:val="Hyperlink"/>
@@ -6168,7 +6367,7 @@
         </w:rPr>
         <w:t xml:space="preserve">, </w:t>
       </w:r>
-      <w:hyperlink r:id="rId88" w:history="1">
+      <w:hyperlink r:id="rId89" w:history="1">
         <w:r>
           <w:rPr>
             <w:rStyle w:val="Hyperlink"/>
@@ -6186,7 +6385,7 @@
         </w:rPr>
         <w:t xml:space="preserve">, </w:t>
       </w:r>
-      <w:hyperlink r:id="rId89" w:history="1">
+      <w:hyperlink r:id="rId90" w:history="1">
         <w:r>
           <w:rPr>
             <w:rStyle w:val="Hyperlink"/>
@@ -6204,7 +6403,7 @@
         </w:rPr>
         <w:t xml:space="preserve">, </w:t>
       </w:r>
-      <w:hyperlink r:id="rId90" w:history="1">
+      <w:hyperlink r:id="rId91" w:history="1">
         <w:r>
           <w:rPr>
             <w:rStyle w:val="Hyperlink"/>
@@ -6249,7 +6448,7 @@
         </w:rPr>
         <w:t xml:space="preserve">, </w:t>
       </w:r>
-      <w:hyperlink r:id="rId84" w:history="1">
+      <w:hyperlink r:id="rId83" w:history="1">
         <w:r>
           <w:rPr>
             <w:rStyle w:val="Hyperlink"/>
@@ -6267,7 +6466,7 @@
         </w:rPr>
         <w:t xml:space="preserve">, Route 89 farm stands — </w:t>
       </w:r>
-      <w:hyperlink r:id="rId107" w:history="1">
+      <w:hyperlink r:id="rId108" w:history="1">
         <w:r>
           <w:rPr>
             <w:rStyle w:val="Hyperlink"/>
@@ -6309,7 +6508,7 @@
         </w:rPr>
         <w:t xml:space="preserve">Cayuga is the longest lake and the most historically layered. When you're ready to go deeper into the region, the </w:t>
       </w:r>
-      <w:hyperlink r:id="rId108" w:history="1">
+      <w:hyperlink r:id="rId109" w:history="1">
         <w:r>
           <w:rPr>
             <w:rStyle w:val="Hyperlink"/>
@@ -6327,7 +6526,7 @@
         </w:rPr>
         <w:t xml:space="preserve"> picks up the wine story thirty-eight miles west, and the </w:t>
       </w:r>
-      <w:hyperlink r:id="rId109" w:history="1">
+      <w:hyperlink r:id="rId110" w:history="1">
         <w:r>
           <w:rPr>
             <w:rStyle w:val="Hyperlink"/>
@@ -6350,7 +6549,7 @@
       <w:pPr>
         <w:shd w:val="clear" w:color="auto" w:fill="EAF4FB"/>
       </w:pPr>
-      <w:hyperlink r:id="rId110" w:history="1">
+      <w:hyperlink r:id="rId111" w:history="1">
         <w:r>
           <w:rPr>
             <w:rStyle w:val="Hyperlink"/>
@@ -6373,7 +6572,7 @@
         </w:rPr>
         <w:t xml:space="preserve">Related: </w:t>
       </w:r>
-      <w:hyperlink r:id="rId111" w:history="1">
+      <w:hyperlink r:id="rId112" w:history="1">
         <w:r>
           <w:rPr>
             <w:rStyle w:val="Hyperlink"/>
@@ -6391,7 +6590,7 @@
         </w:rPr>
         <w:t xml:space="preserve"> · </w:t>
       </w:r>
-      <w:hyperlink r:id="rId85" w:history="1">
+      <w:hyperlink r:id="rId113" w:history="1">
         <w:r>
           <w:rPr>
             <w:rStyle w:val="Hyperlink"/>

</xml_diff>